<commit_message>
eBook chapter 8: medallion runs on Databricks, run-export images, dashboard and access; status updates
Co-Authored-By: Claude Opus 5.5 <noreply@anthropic.com>
Claude-Session: https://claude.ai/code/session_01GpY9vtVnSw1tgz3K4xTp8Q
</commit_message>
<xml_diff>
--- a/inference-data-qa/Employee360_DQ_eBook.docx
+++ b/inference-data-qa/Employee360_DQ_eBook.docx
@@ -1869,7 +1869,7 @@
                 <w:sz w:val="18"/>
                 <w:szCs w:val="18"/>
               </w:rPr>
-              <w:t xml:space="preserve">9</w:t>
+              <w:t xml:space="preserve">8.1</w:t>
             </w:r>
           </w:p>
         </w:tc>
@@ -1897,7 +1897,7 @@
                 <w:sz w:val="18"/>
                 <w:szCs w:val="18"/>
               </w:rPr>
-              <w:t xml:space="preserve">AI use</w:t>
+              <w:t xml:space="preserve">Bronze, Silver, Gold on Databricks</w:t>
             </w:r>
           </w:p>
         </w:tc>
@@ -1925,7 +1925,7 @@
                 <w:sz w:val="18"/>
                 <w:szCs w:val="18"/>
               </w:rPr>
-              <w:t xml:space="preserve">16</w:t>
+              <w:t xml:space="preserve">15</w:t>
             </w:r>
           </w:p>
         </w:tc>
@@ -1958,7 +1958,7 @@
                 <w:sz w:val="18"/>
                 <w:szCs w:val="18"/>
               </w:rPr>
-              <w:t xml:space="preserve">App. A</w:t>
+              <w:t xml:space="preserve">8.2</w:t>
             </w:r>
           </w:p>
         </w:tc>
@@ -1986,7 +1986,7 @@
                 <w:sz w:val="18"/>
                 <w:szCs w:val="18"/>
               </w:rPr>
-              <w:t xml:space="preserve">Files, how to run, assumptions, limitations</w:t>
+              <w:t xml:space="preserve">Dashboard: Employee 360 Data Quality</w:t>
             </w:r>
           </w:p>
         </w:tc>
@@ -2047,7 +2047,7 @@
                 <w:sz w:val="18"/>
                 <w:szCs w:val="18"/>
               </w:rPr>
-              <w:t xml:space="preserve">App. B</w:t>
+              <w:t xml:space="preserve">9</w:t>
             </w:r>
           </w:p>
         </w:tc>
@@ -2075,7 +2075,7 @@
                 <w:sz w:val="18"/>
                 <w:szCs w:val="18"/>
               </w:rPr>
-              <w:t xml:space="preserve">Evidence index</w:t>
+              <w:t xml:space="preserve">AI use</w:t>
             </w:r>
           </w:p>
         </w:tc>
@@ -2104,6 +2104,184 @@
                 <w:szCs w:val="18"/>
               </w:rPr>
               <w:t xml:space="preserve">18</w:t>
+            </w:r>
+          </w:p>
+        </w:tc>
+      </w:tr>
+      <w:tr>
+        <w:trPr>
+          <w:cantSplit/>
+        </w:trPr>
+        <w:tc>
+          <w:tcPr>
+            <w:tcW w:type="dxa" w:w="1100"/>
+            <w:shd w:fill="F7F9FC" w:val="clear"/>
+            <w:tcMar>
+              <w:top w:type="dxa" w:w="50"/>
+              <w:left w:type="dxa" w:w="90"/>
+              <w:bottom w:type="dxa" w:w="50"/>
+              <w:right w:type="dxa" w:w="90"/>
+            </w:tcMar>
+            <w:vAlign w:val="center"/>
+          </w:tcPr>
+          <w:p>
+            <w:pPr>
+              <w:jc w:val="left"/>
+            </w:pPr>
+            <w:r>
+              <w:rPr>
+                <w:b w:val="false"/>
+                <w:bCs w:val="false"/>
+                <w:color w:val="000000"/>
+                <w:sz w:val="18"/>
+                <w:szCs w:val="18"/>
+              </w:rPr>
+              <w:t xml:space="preserve">App. A</w:t>
+            </w:r>
+          </w:p>
+        </w:tc>
+        <w:tc>
+          <w:tcPr>
+            <w:tcW w:type="dxa" w:w="7060"/>
+            <w:shd w:fill="F7F9FC" w:val="clear"/>
+            <w:tcMar>
+              <w:top w:type="dxa" w:w="50"/>
+              <w:left w:type="dxa" w:w="90"/>
+              <w:bottom w:type="dxa" w:w="50"/>
+              <w:right w:type="dxa" w:w="90"/>
+            </w:tcMar>
+            <w:vAlign w:val="center"/>
+          </w:tcPr>
+          <w:p>
+            <w:pPr>
+              <w:jc w:val="left"/>
+            </w:pPr>
+            <w:r>
+              <w:rPr>
+                <w:b w:val="false"/>
+                <w:bCs w:val="false"/>
+                <w:color w:val="000000"/>
+                <w:sz w:val="18"/>
+                <w:szCs w:val="18"/>
+              </w:rPr>
+              <w:t xml:space="preserve">Files, how to run, assumptions, limitations</w:t>
+            </w:r>
+          </w:p>
+        </w:tc>
+        <w:tc>
+          <w:tcPr>
+            <w:tcW w:type="dxa" w:w="1200"/>
+            <w:shd w:fill="F7F9FC" w:val="clear"/>
+            <w:tcMar>
+              <w:top w:type="dxa" w:w="50"/>
+              <w:left w:type="dxa" w:w="90"/>
+              <w:bottom w:type="dxa" w:w="50"/>
+              <w:right w:type="dxa" w:w="90"/>
+            </w:tcMar>
+            <w:vAlign w:val="center"/>
+          </w:tcPr>
+          <w:p>
+            <w:pPr>
+              <w:jc w:val="right"/>
+            </w:pPr>
+            <w:r>
+              <w:rPr>
+                <w:b w:val="false"/>
+                <w:bCs w:val="false"/>
+                <w:color w:val="000000"/>
+                <w:sz w:val="18"/>
+                <w:szCs w:val="18"/>
+              </w:rPr>
+              <w:t xml:space="preserve">19</w:t>
+            </w:r>
+          </w:p>
+        </w:tc>
+      </w:tr>
+      <w:tr>
+        <w:trPr>
+          <w:cantSplit/>
+        </w:trPr>
+        <w:tc>
+          <w:tcPr>
+            <w:tcW w:type="dxa" w:w="1100"/>
+            <w:shd w:fill="FFFFFF" w:val="clear"/>
+            <w:tcMar>
+              <w:top w:type="dxa" w:w="50"/>
+              <w:left w:type="dxa" w:w="90"/>
+              <w:bottom w:type="dxa" w:w="50"/>
+              <w:right w:type="dxa" w:w="90"/>
+            </w:tcMar>
+            <w:vAlign w:val="center"/>
+          </w:tcPr>
+          <w:p>
+            <w:pPr>
+              <w:jc w:val="left"/>
+            </w:pPr>
+            <w:r>
+              <w:rPr>
+                <w:b w:val="false"/>
+                <w:bCs w:val="false"/>
+                <w:color w:val="000000"/>
+                <w:sz w:val="18"/>
+                <w:szCs w:val="18"/>
+              </w:rPr>
+              <w:t xml:space="preserve">App. B</w:t>
+            </w:r>
+          </w:p>
+        </w:tc>
+        <w:tc>
+          <w:tcPr>
+            <w:tcW w:type="dxa" w:w="7060"/>
+            <w:shd w:fill="FFFFFF" w:val="clear"/>
+            <w:tcMar>
+              <w:top w:type="dxa" w:w="50"/>
+              <w:left w:type="dxa" w:w="90"/>
+              <w:bottom w:type="dxa" w:w="50"/>
+              <w:right w:type="dxa" w:w="90"/>
+            </w:tcMar>
+            <w:vAlign w:val="center"/>
+          </w:tcPr>
+          <w:p>
+            <w:pPr>
+              <w:jc w:val="left"/>
+            </w:pPr>
+            <w:r>
+              <w:rPr>
+                <w:b w:val="false"/>
+                <w:bCs w:val="false"/>
+                <w:color w:val="000000"/>
+                <w:sz w:val="18"/>
+                <w:szCs w:val="18"/>
+              </w:rPr>
+              <w:t xml:space="preserve">Evidence index</w:t>
+            </w:r>
+          </w:p>
+        </w:tc>
+        <w:tc>
+          <w:tcPr>
+            <w:tcW w:type="dxa" w:w="1200"/>
+            <w:shd w:fill="FFFFFF" w:val="clear"/>
+            <w:tcMar>
+              <w:top w:type="dxa" w:w="50"/>
+              <w:left w:type="dxa" w:w="90"/>
+              <w:bottom w:type="dxa" w:w="50"/>
+              <w:right w:type="dxa" w:w="90"/>
+            </w:tcMar>
+            <w:vAlign w:val="center"/>
+          </w:tcPr>
+          <w:p>
+            <w:pPr>
+              <w:jc w:val="right"/>
+            </w:pPr>
+            <w:r>
+              <w:rPr>
+                <w:b w:val="false"/>
+                <w:bCs w:val="false"/>
+                <w:color w:val="000000"/>
+                <w:sz w:val="18"/>
+                <w:szCs w:val="18"/>
+              </w:rPr>
+              <w:t xml:space="preserve">20</w:t>
             </w:r>
           </w:p>
         </w:tc>
@@ -3382,7 +3560,7 @@
                 <w:sz w:val="16"/>
                 <w:szCs w:val="16"/>
               </w:rPr>
-              <w:t xml:space="preserve">7, 17</w:t>
+              <w:t xml:space="preserve">7, 19</w:t>
             </w:r>
           </w:p>
         </w:tc>
@@ -4173,7 +4351,7 @@
                 <w:sz w:val="16"/>
                 <w:szCs w:val="16"/>
               </w:rPr>
-              <w:t xml:space="preserve">Ch. 5</w:t>
+              <w:t xml:space="preserve">Ch. 5, §8.2</w:t>
             </w:r>
           </w:p>
         </w:tc>
@@ -4201,7 +4379,7 @@
                 <w:sz w:val="16"/>
                 <w:szCs w:val="16"/>
               </w:rPr>
-              <w:t xml:space="preserve">11</w:t>
+              <w:t xml:space="preserve">11, 17</w:t>
             </w:r>
           </w:p>
         </w:tc>
@@ -4407,7 +4585,7 @@
                 <w:sz w:val="16"/>
                 <w:szCs w:val="16"/>
               </w:rPr>
-              <w:t xml:space="preserve">Ch. 7</w:t>
+              <w:t xml:space="preserve">Ch. 7, §8.1</w:t>
             </w:r>
           </w:p>
         </w:tc>
@@ -4435,7 +4613,7 @@
                 <w:sz w:val="16"/>
                 <w:szCs w:val="16"/>
               </w:rPr>
-              <w:t xml:space="preserve">14</w:t>
+              <w:t xml:space="preserve">14, 15</w:t>
             </w:r>
           </w:p>
         </w:tc>
@@ -4903,7 +5081,7 @@
                 <w:sz w:val="16"/>
                 <w:szCs w:val="16"/>
               </w:rPr>
-              <w:t xml:space="preserve">16</w:t>
+              <w:t xml:space="preserve">18</w:t>
             </w:r>
           </w:p>
         </w:tc>
@@ -5020,7 +5198,7 @@
                 <w:sz w:val="16"/>
                 <w:szCs w:val="16"/>
               </w:rPr>
-              <w:t xml:space="preserve">16</w:t>
+              <w:t xml:space="preserve">18</w:t>
             </w:r>
           </w:p>
         </w:tc>
@@ -5137,7 +5315,7 @@
                 <w:sz w:val="16"/>
                 <w:szCs w:val="16"/>
               </w:rPr>
-              <w:t xml:space="preserve">16</w:t>
+              <w:t xml:space="preserve">18</w:t>
             </w:r>
           </w:p>
         </w:tc>
@@ -5254,7 +5432,7 @@
                 <w:sz w:val="16"/>
                 <w:szCs w:val="16"/>
               </w:rPr>
-              <w:t xml:space="preserve">17</w:t>
+              <w:t xml:space="preserve">19</w:t>
             </w:r>
           </w:p>
         </w:tc>
@@ -18905,6 +19083,1803 @@
     </w:tbl>
     <w:p>
       <w:pPr>
+        <w:pStyle w:val="Heading2"/>
+        <w:keepNext/>
+        <w:keepLines/>
+        <w:spacing w:after="120" w:before="260"/>
+      </w:pPr>
+      <w:r>
+        <w:t xml:space="preserve">8.1 Bronze, Silver, Gold on Databricks</w:t>
+      </w:r>
+    </w:p>
+    <w:p>
+      <w:pPr>
+        <w:spacing w:after="140"/>
+      </w:pPr>
+      <w:r>
+        <w:t xml:space="preserve">Three runs of the medallion notebook, each named for its purpose so the Runs list explains itself. All succeeded on the first attempt with no code change; Gold after run 1 matches the local output in all 576 cells, and the run log, all 19 issue rows and all 10 monitoring rules match too.</w:t>
+      </w:r>
+    </w:p>
+    <w:tbl>
+      <w:tblPr>
+        <w:tblW w:type="dxa" w:w="9360"/>
+        <w:tblBorders>
+          <w:top w:val="single" w:color="auto" w:sz="4"/>
+          <w:left w:val="single" w:color="auto" w:sz="4"/>
+          <w:bottom w:val="single" w:color="auto" w:sz="4"/>
+          <w:right w:val="single" w:color="auto" w:sz="4"/>
+          <w:insideH w:val="single" w:color="auto" w:sz="4"/>
+          <w:insideV w:val="single" w:color="auto" w:sz="4"/>
+        </w:tblBorders>
+      </w:tblPr>
+      <w:tblGrid>
+        <w:gridCol w:w="6160"/>
+        <w:gridCol w:w="1800"/>
+        <w:gridCol w:w="1400"/>
+      </w:tblGrid>
+      <w:tr>
+        <w:trPr>
+          <w:cantSplit/>
+          <w:tblHeader/>
+        </w:trPr>
+        <w:tc>
+          <w:tcPr>
+            <w:tcW w:type="dxa" w:w="6160"/>
+            <w:shd w:fill="1F3864" w:val="clear"/>
+            <w:tcMar>
+              <w:top w:type="dxa" w:w="50"/>
+              <w:left w:type="dxa" w:w="90"/>
+              <w:bottom w:type="dxa" w:w="50"/>
+              <w:right w:type="dxa" w:w="90"/>
+            </w:tcMar>
+            <w:vAlign w:val="center"/>
+          </w:tcPr>
+          <w:p>
+            <w:pPr>
+              <w:jc w:val="left"/>
+            </w:pPr>
+            <w:r>
+              <w:rPr>
+                <w:b/>
+                <w:bCs/>
+                <w:color w:val="FFFFFF"/>
+                <w:sz w:val="16"/>
+                <w:szCs w:val="16"/>
+              </w:rPr>
+              <w:t xml:space="preserve">Run name</w:t>
+            </w:r>
+          </w:p>
+        </w:tc>
+        <w:tc>
+          <w:tcPr>
+            <w:tcW w:type="dxa" w:w="1800"/>
+            <w:shd w:fill="1F3864" w:val="clear"/>
+            <w:tcMar>
+              <w:top w:type="dxa" w:w="50"/>
+              <w:left w:type="dxa" w:w="90"/>
+              <w:bottom w:type="dxa" w:w="50"/>
+              <w:right w:type="dxa" w:w="90"/>
+            </w:tcMar>
+            <w:vAlign w:val="center"/>
+          </w:tcPr>
+          <w:p>
+            <w:pPr>
+              <w:jc w:val="left"/>
+            </w:pPr>
+            <w:r>
+              <w:rPr>
+                <w:b/>
+                <w:bCs/>
+                <w:color w:val="FFFFFF"/>
+                <w:sz w:val="16"/>
+                <w:szCs w:val="16"/>
+              </w:rPr>
+              <w:t xml:space="preserve">Result</w:t>
+            </w:r>
+          </w:p>
+        </w:tc>
+        <w:tc>
+          <w:tcPr>
+            <w:tcW w:type="dxa" w:w="1400"/>
+            <w:shd w:fill="1F3864" w:val="clear"/>
+            <w:tcMar>
+              <w:top w:type="dxa" w:w="50"/>
+              <w:left w:type="dxa" w:w="90"/>
+              <w:bottom w:type="dxa" w:w="50"/>
+              <w:right w:type="dxa" w:w="90"/>
+            </w:tcMar>
+            <w:vAlign w:val="center"/>
+          </w:tcPr>
+          <w:p>
+            <w:pPr>
+              <w:jc w:val="right"/>
+            </w:pPr>
+            <w:r>
+              <w:rPr>
+                <w:b/>
+                <w:bCs/>
+                <w:color w:val="FFFFFF"/>
+                <w:sz w:val="16"/>
+                <w:szCs w:val="16"/>
+              </w:rPr>
+              <w:t xml:space="preserve">Duration</w:t>
+            </w:r>
+          </w:p>
+        </w:tc>
+      </w:tr>
+      <w:tr>
+        <w:trPr>
+          <w:cantSplit/>
+        </w:trPr>
+        <w:tc>
+          <w:tcPr>
+            <w:tcW w:type="dxa" w:w="6160"/>
+            <w:shd w:fill="FFFFFF" w:val="clear"/>
+            <w:tcMar>
+              <w:top w:type="dxa" w:w="50"/>
+              <w:left w:type="dxa" w:w="90"/>
+              <w:bottom w:type="dxa" w:w="50"/>
+              <w:right w:type="dxa" w:w="90"/>
+            </w:tcMar>
+            <w:vAlign w:val="center"/>
+          </w:tcPr>
+          <w:p>
+            <w:pPr>
+              <w:jc w:val="left"/>
+            </w:pPr>
+            <w:r>
+              <w:rPr>
+                <w:b w:val="false"/>
+                <w:bCs w:val="false"/>
+                <w:color w:val="000000"/>
+                <w:sz w:val="16"/>
+                <w:szCs w:val="16"/>
+              </w:rPr>
+              <w:t xml:space="preserve">Medallion run 1 of 3 | supplied data, full load</w:t>
+            </w:r>
+          </w:p>
+        </w:tc>
+        <w:tc>
+          <w:tcPr>
+            <w:tcW w:type="dxa" w:w="1800"/>
+            <w:shd w:fill="FFFFFF" w:val="clear"/>
+            <w:tcMar>
+              <w:top w:type="dxa" w:w="50"/>
+              <w:left w:type="dxa" w:w="90"/>
+              <w:bottom w:type="dxa" w:w="50"/>
+              <w:right w:type="dxa" w:w="90"/>
+            </w:tcMar>
+            <w:vAlign w:val="center"/>
+          </w:tcPr>
+          <w:p>
+            <w:pPr>
+              <w:jc w:val="left"/>
+            </w:pPr>
+            <w:r>
+              <w:rPr>
+                <w:b w:val="false"/>
+                <w:bCs w:val="false"/>
+                <w:color w:val="000000"/>
+                <w:sz w:val="16"/>
+                <w:szCs w:val="16"/>
+              </w:rPr>
+              <w:t xml:space="preserve">SUCCESS</w:t>
+            </w:r>
+          </w:p>
+        </w:tc>
+        <w:tc>
+          <w:tcPr>
+            <w:tcW w:type="dxa" w:w="1400"/>
+            <w:shd w:fill="FFFFFF" w:val="clear"/>
+            <w:tcMar>
+              <w:top w:type="dxa" w:w="50"/>
+              <w:left w:type="dxa" w:w="90"/>
+              <w:bottom w:type="dxa" w:w="50"/>
+              <w:right w:type="dxa" w:w="90"/>
+            </w:tcMar>
+            <w:vAlign w:val="center"/>
+          </w:tcPr>
+          <w:p>
+            <w:pPr>
+              <w:jc w:val="right"/>
+            </w:pPr>
+            <w:r>
+              <w:rPr>
+                <w:b w:val="false"/>
+                <w:bCs w:val="false"/>
+                <w:color w:val="000000"/>
+                <w:sz w:val="16"/>
+                <w:szCs w:val="16"/>
+              </w:rPr>
+              <w:t xml:space="preserve">780 s</w:t>
+            </w:r>
+          </w:p>
+        </w:tc>
+      </w:tr>
+      <w:tr>
+        <w:trPr>
+          <w:cantSplit/>
+        </w:trPr>
+        <w:tc>
+          <w:tcPr>
+            <w:tcW w:type="dxa" w:w="6160"/>
+            <w:shd w:fill="F7F9FC" w:val="clear"/>
+            <w:tcMar>
+              <w:top w:type="dxa" w:w="50"/>
+              <w:left w:type="dxa" w:w="90"/>
+              <w:bottom w:type="dxa" w:w="50"/>
+              <w:right w:type="dxa" w:w="90"/>
+            </w:tcMar>
+            <w:vAlign w:val="center"/>
+          </w:tcPr>
+          <w:p>
+            <w:pPr>
+              <w:jc w:val="left"/>
+            </w:pPr>
+            <w:r>
+              <w:rPr>
+                <w:b w:val="false"/>
+                <w:bCs w:val="false"/>
+                <w:color w:val="000000"/>
+                <w:sz w:val="16"/>
+                <w:szCs w:val="16"/>
+              </w:rPr>
+              <w:t xml:space="preserve">Medallion run 2 of 3 | same files again, should skip</w:t>
+            </w:r>
+          </w:p>
+        </w:tc>
+        <w:tc>
+          <w:tcPr>
+            <w:tcW w:type="dxa" w:w="1800"/>
+            <w:shd w:fill="F7F9FC" w:val="clear"/>
+            <w:tcMar>
+              <w:top w:type="dxa" w:w="50"/>
+              <w:left w:type="dxa" w:w="90"/>
+              <w:bottom w:type="dxa" w:w="50"/>
+              <w:right w:type="dxa" w:w="90"/>
+            </w:tcMar>
+            <w:vAlign w:val="center"/>
+          </w:tcPr>
+          <w:p>
+            <w:pPr>
+              <w:jc w:val="left"/>
+            </w:pPr>
+            <w:r>
+              <w:rPr>
+                <w:b w:val="false"/>
+                <w:bCs w:val="false"/>
+                <w:color w:val="000000"/>
+                <w:sz w:val="16"/>
+                <w:szCs w:val="16"/>
+              </w:rPr>
+              <w:t xml:space="preserve">SUCCESS</w:t>
+            </w:r>
+          </w:p>
+        </w:tc>
+        <w:tc>
+          <w:tcPr>
+            <w:tcW w:type="dxa" w:w="1400"/>
+            <w:shd w:fill="F7F9FC" w:val="clear"/>
+            <w:tcMar>
+              <w:top w:type="dxa" w:w="50"/>
+              <w:left w:type="dxa" w:w="90"/>
+              <w:bottom w:type="dxa" w:w="50"/>
+              <w:right w:type="dxa" w:w="90"/>
+            </w:tcMar>
+            <w:vAlign w:val="center"/>
+          </w:tcPr>
+          <w:p>
+            <w:pPr>
+              <w:jc w:val="right"/>
+            </w:pPr>
+            <w:r>
+              <w:rPr>
+                <w:b w:val="false"/>
+                <w:bCs w:val="false"/>
+                <w:color w:val="000000"/>
+                <w:sz w:val="16"/>
+                <w:szCs w:val="16"/>
+              </w:rPr>
+              <w:t xml:space="preserve">34 s</w:t>
+            </w:r>
+          </w:p>
+        </w:tc>
+      </w:tr>
+      <w:tr>
+        <w:trPr>
+          <w:cantSplit/>
+        </w:trPr>
+        <w:tc>
+          <w:tcPr>
+            <w:tcW w:type="dxa" w:w="6160"/>
+            <w:shd w:fill="FFFFFF" w:val="clear"/>
+            <w:tcMar>
+              <w:top w:type="dxa" w:w="50"/>
+              <w:left w:type="dxa" w:w="90"/>
+              <w:bottom w:type="dxa" w:w="50"/>
+              <w:right w:type="dxa" w:w="90"/>
+            </w:tcMar>
+            <w:vAlign w:val="center"/>
+          </w:tcPr>
+          <w:p>
+            <w:pPr>
+              <w:jc w:val="left"/>
+            </w:pPr>
+            <w:r>
+              <w:rPr>
+                <w:b w:val="false"/>
+                <w:bCs w:val="false"/>
+                <w:color w:val="000000"/>
+                <w:sz w:val="16"/>
+                <w:szCs w:val="16"/>
+              </w:rPr>
+              <w:t xml:space="preserve">Medallion run 3 of 3 | simulated fixes + 1 new issue</w:t>
+            </w:r>
+          </w:p>
+        </w:tc>
+        <w:tc>
+          <w:tcPr>
+            <w:tcW w:type="dxa" w:w="1800"/>
+            <w:shd w:fill="FFFFFF" w:val="clear"/>
+            <w:tcMar>
+              <w:top w:type="dxa" w:w="50"/>
+              <w:left w:type="dxa" w:w="90"/>
+              <w:bottom w:type="dxa" w:w="50"/>
+              <w:right w:type="dxa" w:w="90"/>
+            </w:tcMar>
+            <w:vAlign w:val="center"/>
+          </w:tcPr>
+          <w:p>
+            <w:pPr>
+              <w:jc w:val="left"/>
+            </w:pPr>
+            <w:r>
+              <w:rPr>
+                <w:b w:val="false"/>
+                <w:bCs w:val="false"/>
+                <w:color w:val="000000"/>
+                <w:sz w:val="16"/>
+                <w:szCs w:val="16"/>
+              </w:rPr>
+              <w:t xml:space="preserve">SUCCESS</w:t>
+            </w:r>
+          </w:p>
+        </w:tc>
+        <w:tc>
+          <w:tcPr>
+            <w:tcW w:type="dxa" w:w="1400"/>
+            <w:shd w:fill="FFFFFF" w:val="clear"/>
+            <w:tcMar>
+              <w:top w:type="dxa" w:w="50"/>
+              <w:left w:type="dxa" w:w="90"/>
+              <w:bottom w:type="dxa" w:w="50"/>
+              <w:right w:type="dxa" w:w="90"/>
+            </w:tcMar>
+            <w:vAlign w:val="center"/>
+          </w:tcPr>
+          <w:p>
+            <w:pPr>
+              <w:jc w:val="right"/>
+            </w:pPr>
+            <w:r>
+              <w:rPr>
+                <w:b w:val="false"/>
+                <w:bCs w:val="false"/>
+                <w:color w:val="000000"/>
+                <w:sz w:val="16"/>
+                <w:szCs w:val="16"/>
+              </w:rPr>
+              <w:t xml:space="preserve">293 s</w:t>
+            </w:r>
+          </w:p>
+        </w:tc>
+      </w:tr>
+    </w:tbl>
+    <w:p>
+      <w:pPr>
+        <w:keepNext/>
+        <w:spacing w:after="60" w:before="160"/>
+        <w:jc w:val="center"/>
+      </w:pPr>
+      <w:r>
+        <w:drawing>
+          <wp:inline distT="0" distB="0" distL="0" distR="0">
+            <wp:extent cx="5715000" cy="1724025"/>
+            <wp:effectExtent t="0" r="0" b="0" l="0"/>
+            <wp:docPr id="10" name="" descr="" title=""/>
+            <wp:cNvGraphicFramePr>
+              <a:graphicFrameLocks xmlns:a="http://schemas.openxmlformats.org/drawingml/2006/main" noChangeAspect="1"/>
+            </wp:cNvGraphicFramePr>
+            <a:graphic xmlns:a="http://schemas.openxmlformats.org/drawingml/2006/main">
+              <a:graphicData uri="http://schemas.openxmlformats.org/drawingml/2006/picture">
+                <pic:pic xmlns:pic="http://schemas.openxmlformats.org/drawingml/2006/picture">
+                  <pic:nvPicPr>
+                    <pic:cNvPr id="0" name="" descr=""/>
+                    <pic:cNvPicPr>
+                      <a:picLocks noChangeAspect="1" noChangeArrowheads="1"/>
+                    </pic:cNvPicPr>
+                  </pic:nvPicPr>
+                  <pic:blipFill>
+                    <a:blip r:embed="rId18" cstate="none"/>
+                    <a:srcRect/>
+                    <a:stretch>
+                      <a:fillRect/>
+                    </a:stretch>
+                  </pic:blipFill>
+                  <pic:spPr bwMode="auto">
+                    <a:xfrm>
+                      <a:off x="0" y="0"/>
+                      <a:ext cx="5715000" cy="1724025"/>
+                    </a:xfrm>
+                    <a:prstGeom prst="rect">
+                      <a:avLst/>
+                    </a:prstGeom>
+                  </pic:spPr>
+                </pic:pic>
+              </a:graphicData>
+            </a:graphic>
+          </wp:inline>
+        </w:drawing>
+      </w:r>
+    </w:p>
+    <w:p>
+      <w:pPr>
+        <w:spacing w:after="200"/>
+        <w:jc w:val="center"/>
+      </w:pPr>
+      <w:r>
+        <w:rPr>
+          <w:i/>
+          <w:iCs/>
+          <w:color w:val="595959"/>
+          <w:sz w:val="17"/>
+          <w:szCs w:val="17"/>
+        </w:rPr>
+        <w:t xml:space="preserve">Figure 10. Run 1 on Databricks: the monitoring table (10 rules, all FAIL) and the release decision BLOCK.</w:t>
+      </w:r>
+      <w:r>
+        <w:rPr>
+          <w:color w:val="0E7C7B"/>
+          <w:sz w:val="15"/>
+          <w:szCs w:val="15"/>
+        </w:rPr>
+        <w:t xml:space="preserve">  [Databricks run export (rendered, not a browser screenshot)]</w:t>
+      </w:r>
+    </w:p>
+    <w:p>
+      <w:pPr>
+        <w:keepNext/>
+        <w:spacing w:after="60" w:before="160"/>
+        <w:jc w:val="center"/>
+      </w:pPr>
+      <w:r>
+        <w:drawing>
+          <wp:inline distT="0" distB="0" distL="0" distR="0">
+            <wp:extent cx="5715000" cy="3952875"/>
+            <wp:effectExtent t="0" r="0" b="0" l="0"/>
+            <wp:docPr id="11" name="" descr="" title=""/>
+            <wp:cNvGraphicFramePr>
+              <a:graphicFrameLocks xmlns:a="http://schemas.openxmlformats.org/drawingml/2006/main" noChangeAspect="1"/>
+            </wp:cNvGraphicFramePr>
+            <a:graphic xmlns:a="http://schemas.openxmlformats.org/drawingml/2006/main">
+              <a:graphicData uri="http://schemas.openxmlformats.org/drawingml/2006/picture">
+                <pic:pic xmlns:pic="http://schemas.openxmlformats.org/drawingml/2006/picture">
+                  <pic:nvPicPr>
+                    <pic:cNvPr id="0" name="" descr=""/>
+                    <pic:cNvPicPr>
+                      <a:picLocks noChangeAspect="1" noChangeArrowheads="1"/>
+                    </pic:cNvPicPr>
+                  </pic:nvPicPr>
+                  <pic:blipFill>
+                    <a:blip r:embed="rId19" cstate="none"/>
+                    <a:srcRect/>
+                    <a:stretch>
+                      <a:fillRect/>
+                    </a:stretch>
+                  </pic:blipFill>
+                  <pic:spPr bwMode="auto">
+                    <a:xfrm>
+                      <a:off x="0" y="0"/>
+                      <a:ext cx="5715000" cy="3952875"/>
+                    </a:xfrm>
+                    <a:prstGeom prst="rect">
+                      <a:avLst/>
+                    </a:prstGeom>
+                  </pic:spPr>
+                </pic:pic>
+              </a:graphicData>
+            </a:graphic>
+          </wp:inline>
+        </w:drawing>
+      </w:r>
+    </w:p>
+    <w:p>
+      <w:pPr>
+        <w:spacing w:after="200"/>
+        <w:jc w:val="center"/>
+      </w:pPr>
+      <w:r>
+        <w:rPr>
+          <w:i/>
+          <w:iCs/>
+          <w:color w:val="595959"/>
+          <w:sz w:val="17"/>
+          <w:szCs w:val="17"/>
+        </w:rPr>
+        <w:t xml:space="preserve">Figure 11. Run 1 on Databricks: Gold records that are not trusted, and why; row counts per layer.</w:t>
+      </w:r>
+      <w:r>
+        <w:rPr>
+          <w:color w:val="0E7C7B"/>
+          <w:sz w:val="15"/>
+          <w:szCs w:val="15"/>
+        </w:rPr>
+        <w:t xml:space="preserve">  [Databricks run export (rendered, not a browser screenshot)]</w:t>
+      </w:r>
+    </w:p>
+    <w:p>
+      <w:pPr>
+        <w:keepNext/>
+        <w:spacing w:after="60" w:before="160"/>
+        <w:jc w:val="center"/>
+      </w:pPr>
+      <w:r>
+        <w:drawing>
+          <wp:inline distT="0" distB="0" distL="0" distR="0">
+            <wp:extent cx="5715000" cy="2238375"/>
+            <wp:effectExtent t="0" r="0" b="0" l="0"/>
+            <wp:docPr id="12" name="" descr="" title=""/>
+            <wp:cNvGraphicFramePr>
+              <a:graphicFrameLocks xmlns:a="http://schemas.openxmlformats.org/drawingml/2006/main" noChangeAspect="1"/>
+            </wp:cNvGraphicFramePr>
+            <a:graphic xmlns:a="http://schemas.openxmlformats.org/drawingml/2006/main">
+              <a:graphicData uri="http://schemas.openxmlformats.org/drawingml/2006/picture">
+                <pic:pic xmlns:pic="http://schemas.openxmlformats.org/drawingml/2006/picture">
+                  <pic:nvPicPr>
+                    <pic:cNvPr id="0" name="" descr=""/>
+                    <pic:cNvPicPr>
+                      <a:picLocks noChangeAspect="1" noChangeArrowheads="1"/>
+                    </pic:cNvPicPr>
+                  </pic:nvPicPr>
+                  <pic:blipFill>
+                    <a:blip r:embed="rId20" cstate="none"/>
+                    <a:srcRect/>
+                    <a:stretch>
+                      <a:fillRect/>
+                    </a:stretch>
+                  </pic:blipFill>
+                  <pic:spPr bwMode="auto">
+                    <a:xfrm>
+                      <a:off x="0" y="0"/>
+                      <a:ext cx="5715000" cy="2238375"/>
+                    </a:xfrm>
+                    <a:prstGeom prst="rect">
+                      <a:avLst/>
+                    </a:prstGeom>
+                  </pic:spPr>
+                </pic:pic>
+              </a:graphicData>
+            </a:graphic>
+          </wp:inline>
+        </w:drawing>
+      </w:r>
+    </w:p>
+    <w:p>
+      <w:pPr>
+        <w:spacing w:after="200"/>
+        <w:jc w:val="center"/>
+      </w:pPr>
+      <w:r>
+        <w:rPr>
+          <w:i/>
+          <w:iCs/>
+          <w:color w:val="595959"/>
+          <w:sz w:val="17"/>
+          <w:szCs w:val="17"/>
+        </w:rPr>
+        <w:t xml:space="preserve">Figure 12. Run 2 on Databricks: same files again, 0 rows inserted, checks skipped.</w:t>
+      </w:r>
+      <w:r>
+        <w:rPr>
+          <w:color w:val="0E7C7B"/>
+          <w:sz w:val="15"/>
+          <w:szCs w:val="15"/>
+        </w:rPr>
+        <w:t xml:space="preserve">  [Databricks run export (rendered, not a browser screenshot)]</w:t>
+      </w:r>
+    </w:p>
+    <w:p>
+      <w:pPr>
+        <w:keepNext/>
+        <w:spacing w:after="60" w:before="160"/>
+        <w:jc w:val="center"/>
+      </w:pPr>
+      <w:r>
+        <w:drawing>
+          <wp:inline distT="0" distB="0" distL="0" distR="0">
+            <wp:extent cx="5715000" cy="1295400"/>
+            <wp:effectExtent t="0" r="0" b="0" l="0"/>
+            <wp:docPr id="13" name="" descr="" title=""/>
+            <wp:cNvGraphicFramePr>
+              <a:graphicFrameLocks xmlns:a="http://schemas.openxmlformats.org/drawingml/2006/main" noChangeAspect="1"/>
+            </wp:cNvGraphicFramePr>
+            <a:graphic xmlns:a="http://schemas.openxmlformats.org/drawingml/2006/main">
+              <a:graphicData uri="http://schemas.openxmlformats.org/drawingml/2006/picture">
+                <pic:pic xmlns:pic="http://schemas.openxmlformats.org/drawingml/2006/picture">
+                  <pic:nvPicPr>
+                    <pic:cNvPr id="0" name="" descr=""/>
+                    <pic:cNvPicPr>
+                      <a:picLocks noChangeAspect="1" noChangeArrowheads="1"/>
+                    </pic:cNvPicPr>
+                  </pic:nvPicPr>
+                  <pic:blipFill>
+                    <a:blip r:embed="rId21" cstate="none"/>
+                    <a:srcRect/>
+                    <a:stretch>
+                      <a:fillRect/>
+                    </a:stretch>
+                  </pic:blipFill>
+                  <pic:spPr bwMode="auto">
+                    <a:xfrm>
+                      <a:off x="0" y="0"/>
+                      <a:ext cx="5715000" cy="1295400"/>
+                    </a:xfrm>
+                    <a:prstGeom prst="rect">
+                      <a:avLst/>
+                    </a:prstGeom>
+                  </pic:spPr>
+                </pic:pic>
+              </a:graphicData>
+            </a:graphic>
+          </wp:inline>
+        </w:drawing>
+      </w:r>
+    </w:p>
+    <w:p>
+      <w:pPr>
+        <w:spacing w:after="200"/>
+        <w:jc w:val="center"/>
+      </w:pPr>
+      <w:r>
+        <w:rPr>
+          <w:i/>
+          <w:iCs/>
+          <w:color w:val="595959"/>
+          <w:sz w:val="17"/>
+          <w:szCs w:val="17"/>
+        </w:rPr>
+        <w:t xml:space="preserve">Figure 13. Run 3 on Databricks (simulated delivery): the only two alerts, and the run summary.</w:t>
+      </w:r>
+      <w:r>
+        <w:rPr>
+          <w:color w:val="0E7C7B"/>
+          <w:sz w:val="15"/>
+          <w:szCs w:val="15"/>
+        </w:rPr>
+        <w:t xml:space="preserve">  [Databricks run export (rendered, not a browser screenshot)]</w:t>
+      </w:r>
+    </w:p>
+    <w:p>
+      <w:pPr>
+        <w:pStyle w:val="Heading2"/>
+        <w:keepNext/>
+        <w:keepLines/>
+        <w:spacing w:after="120" w:before="260"/>
+      </w:pPr>
+      <w:r>
+        <w:t xml:space="preserve">8.2 Dashboard: Employee 360 Data Quality</w:t>
+      </w:r>
+    </w:p>
+    <w:p>
+      <w:pPr>
+        <w:keepNext/>
+        <w:pBdr>
+          <w:left w:val="single" w:color="0E7C7B" w:sz="18" w:space="6"/>
+        </w:pBdr>
+        <w:shd w:fill="EEF3F8" w:val="clear"/>
+        <w:spacing w:after="160"/>
+        <w:ind w:left="120"/>
+      </w:pPr>
+      <w:r>
+        <w:rPr>
+          <w:b/>
+          <w:bCs/>
+          <w:color w:val="0E7C7B"/>
+          <w:sz w:val="18"/>
+          <w:szCs w:val="18"/>
+        </w:rPr>
+        <w:t xml:space="preserve">Answers  </w:t>
+      </w:r>
+      <w:r>
+        <w:rPr>
+          <w:color w:val="595959"/>
+          <w:sz w:val="18"/>
+          <w:szCs w:val="18"/>
+        </w:rPr>
+        <w:t xml:space="preserve">Task 5 · a usable monitoring output, live in Databricks AI/BI</w:t>
+      </w:r>
+    </w:p>
+    <w:p>
+      <w:pPr>
+        <w:spacing w:after="140"/>
+      </w:pPr>
+      <w:r>
+        <w:t xml:space="preserve">A Databricks AI/BI dashboard on the Gold and monitoring tables, deployed from dashboards/employee360_dq.lvdash.json. Headline numbers come from the supplied data (run 1, kept with Delta time travel); anything from run 3 is labelled as the simulated delivery.</w:t>
+      </w:r>
+    </w:p>
+    <w:tbl>
+      <w:tblPr>
+        <w:tblW w:type="dxa" w:w="9360"/>
+        <w:tblBorders>
+          <w:top w:val="single" w:color="auto" w:sz="4"/>
+          <w:left w:val="single" w:color="auto" w:sz="4"/>
+          <w:bottom w:val="single" w:color="auto" w:sz="4"/>
+          <w:right w:val="single" w:color="auto" w:sz="4"/>
+          <w:insideH w:val="single" w:color="auto" w:sz="4"/>
+          <w:insideV w:val="single" w:color="auto" w:sz="4"/>
+        </w:tblBorders>
+      </w:tblPr>
+      <w:tblGrid>
+        <w:gridCol w:w="3000"/>
+        <w:gridCol w:w="6360"/>
+      </w:tblGrid>
+      <w:tr>
+        <w:trPr>
+          <w:cantSplit/>
+          <w:tblHeader/>
+        </w:trPr>
+        <w:tc>
+          <w:tcPr>
+            <w:tcW w:type="dxa" w:w="3000"/>
+            <w:shd w:fill="1F3864" w:val="clear"/>
+            <w:tcMar>
+              <w:top w:type="dxa" w:w="50"/>
+              <w:left w:type="dxa" w:w="90"/>
+              <w:bottom w:type="dxa" w:w="50"/>
+              <w:right w:type="dxa" w:w="90"/>
+            </w:tcMar>
+            <w:vAlign w:val="center"/>
+          </w:tcPr>
+          <w:p>
+            <w:pPr>
+              <w:jc w:val="left"/>
+            </w:pPr>
+            <w:r>
+              <w:rPr>
+                <w:b/>
+                <w:bCs/>
+                <w:color w:val="FFFFFF"/>
+                <w:sz w:val="17"/>
+                <w:szCs w:val="17"/>
+              </w:rPr>
+              <w:t xml:space="preserve">Page</w:t>
+            </w:r>
+          </w:p>
+        </w:tc>
+        <w:tc>
+          <w:tcPr>
+            <w:tcW w:type="dxa" w:w="6360"/>
+            <w:shd w:fill="1F3864" w:val="clear"/>
+            <w:tcMar>
+              <w:top w:type="dxa" w:w="50"/>
+              <w:left w:type="dxa" w:w="90"/>
+              <w:bottom w:type="dxa" w:w="50"/>
+              <w:right w:type="dxa" w:w="90"/>
+            </w:tcMar>
+            <w:vAlign w:val="center"/>
+          </w:tcPr>
+          <w:p>
+            <w:pPr>
+              <w:jc w:val="left"/>
+            </w:pPr>
+            <w:r>
+              <w:rPr>
+                <w:b/>
+                <w:bCs/>
+                <w:color w:val="FFFFFF"/>
+                <w:sz w:val="17"/>
+                <w:szCs w:val="17"/>
+              </w:rPr>
+              <w:t xml:space="preserve">What it shows</w:t>
+            </w:r>
+          </w:p>
+        </w:tc>
+      </w:tr>
+      <w:tr>
+        <w:trPr>
+          <w:cantSplit/>
+        </w:trPr>
+        <w:tc>
+          <w:tcPr>
+            <w:tcW w:type="dxa" w:w="3000"/>
+            <w:shd w:fill="FFFFFF" w:val="clear"/>
+            <w:tcMar>
+              <w:top w:type="dxa" w:w="50"/>
+              <w:left w:type="dxa" w:w="90"/>
+              <w:bottom w:type="dxa" w:w="50"/>
+              <w:right w:type="dxa" w:w="90"/>
+            </w:tcMar>
+            <w:vAlign w:val="center"/>
+          </w:tcPr>
+          <w:p>
+            <w:pPr>
+              <w:jc w:val="left"/>
+            </w:pPr>
+            <w:r>
+              <w:rPr>
+                <w:b w:val="false"/>
+                <w:bCs w:val="false"/>
+                <w:color w:val="000000"/>
+                <w:sz w:val="17"/>
+                <w:szCs w:val="17"/>
+              </w:rPr>
+              <w:t xml:space="preserve">1 · Release gate (supplied data)</w:t>
+            </w:r>
+          </w:p>
+        </w:tc>
+        <w:tc>
+          <w:tcPr>
+            <w:tcW w:type="dxa" w:w="6360"/>
+            <w:shd w:fill="FFFFFF" w:val="clear"/>
+            <w:tcMar>
+              <w:top w:type="dxa" w:w="50"/>
+              <w:left w:type="dxa" w:w="90"/>
+              <w:bottom w:type="dxa" w:w="50"/>
+              <w:right w:type="dxa" w:w="90"/>
+            </w:tcMar>
+            <w:vAlign w:val="center"/>
+          </w:tcPr>
+          <w:p>
+            <w:pPr>
+              <w:jc w:val="left"/>
+            </w:pPr>
+            <w:r>
+              <w:rPr>
+                <w:b w:val="false"/>
+                <w:bCs w:val="false"/>
+                <w:color w:val="000000"/>
+                <w:sz w:val="17"/>
+                <w:szCs w:val="17"/>
+              </w:rPr>
+              <w:t xml:space="preserve">Decision BLOCK, 10 of 10 rules failing, 5 blocking, affected employees by rule and severity, the full rule table with owners</w:t>
+            </w:r>
+          </w:p>
+        </w:tc>
+      </w:tr>
+      <w:tr>
+        <w:trPr>
+          <w:cantSplit/>
+        </w:trPr>
+        <w:tc>
+          <w:tcPr>
+            <w:tcW w:type="dxa" w:w="3000"/>
+            <w:shd w:fill="F7F9FC" w:val="clear"/>
+            <w:tcMar>
+              <w:top w:type="dxa" w:w="50"/>
+              <w:left w:type="dxa" w:w="90"/>
+              <w:bottom w:type="dxa" w:w="50"/>
+              <w:right w:type="dxa" w:w="90"/>
+            </w:tcMar>
+            <w:vAlign w:val="center"/>
+          </w:tcPr>
+          <w:p>
+            <w:pPr>
+              <w:jc w:val="left"/>
+            </w:pPr>
+            <w:r>
+              <w:rPr>
+                <w:b w:val="false"/>
+                <w:bCs w:val="false"/>
+                <w:color w:val="000000"/>
+                <w:sz w:val="17"/>
+                <w:szCs w:val="17"/>
+              </w:rPr>
+              <w:t xml:space="preserve">2 · Reconciliation and Gold</w:t>
+            </w:r>
+          </w:p>
+        </w:tc>
+        <w:tc>
+          <w:tcPr>
+            <w:tcW w:type="dxa" w:w="6360"/>
+            <w:shd w:fill="F7F9FC" w:val="clear"/>
+            <w:tcMar>
+              <w:top w:type="dxa" w:w="50"/>
+              <w:left w:type="dxa" w:w="90"/>
+              <w:bottom w:type="dxa" w:w="50"/>
+              <w:right w:type="dxa" w:w="90"/>
+            </w:tcMar>
+            <w:vAlign w:val="center"/>
+          </w:tcPr>
+          <w:p>
+            <w:pPr>
+              <w:jc w:val="left"/>
+            </w:pPr>
+            <w:r>
+              <w:rPr>
+                <w:b w:val="false"/>
+                <w:bCs w:val="false"/>
+                <w:color w:val="000000"/>
+                <w:sz w:val="17"/>
+                <w:szCs w:val="17"/>
+              </w:rPr>
+              <w:t xml:space="preserve">Reconciliation categories (below), Gold against the delivered Employee 360, untrusted Gold records, failure detail by rule</w:t>
+            </w:r>
+          </w:p>
+        </w:tc>
+      </w:tr>
+      <w:tr>
+        <w:trPr>
+          <w:cantSplit/>
+        </w:trPr>
+        <w:tc>
+          <w:tcPr>
+            <w:tcW w:type="dxa" w:w="3000"/>
+            <w:shd w:fill="FFFFFF" w:val="clear"/>
+            <w:tcMar>
+              <w:top w:type="dxa" w:w="50"/>
+              <w:left w:type="dxa" w:w="90"/>
+              <w:bottom w:type="dxa" w:w="50"/>
+              <w:right w:type="dxa" w:w="90"/>
+            </w:tcMar>
+            <w:vAlign w:val="center"/>
+          </w:tcPr>
+          <w:p>
+            <w:pPr>
+              <w:jc w:val="left"/>
+            </w:pPr>
+            <w:r>
+              <w:rPr>
+                <w:b w:val="false"/>
+                <w:bCs w:val="false"/>
+                <w:color w:val="000000"/>
+                <w:sz w:val="17"/>
+                <w:szCs w:val="17"/>
+              </w:rPr>
+              <w:t xml:space="preserve">3 · Pipeline runs and issue lifecycle</w:t>
+            </w:r>
+          </w:p>
+        </w:tc>
+        <w:tc>
+          <w:tcPr>
+            <w:tcW w:type="dxa" w:w="6360"/>
+            <w:shd w:fill="FFFFFF" w:val="clear"/>
+            <w:tcMar>
+              <w:top w:type="dxa" w:w="50"/>
+              <w:left w:type="dxa" w:w="90"/>
+              <w:bottom w:type="dxa" w:w="50"/>
+              <w:right w:type="dxa" w:w="90"/>
+            </w:tcMar>
+            <w:vAlign w:val="center"/>
+          </w:tcPr>
+          <w:p>
+            <w:pPr>
+              <w:jc w:val="left"/>
+            </w:pPr>
+            <w:r>
+              <w:rPr>
+                <w:b w:val="false"/>
+                <w:bCs w:val="false"/>
+                <w:color w:val="000000"/>
+                <w:sz w:val="17"/>
+                <w:szCs w:val="17"/>
+              </w:rPr>
+              <w:t xml:space="preserve">New, resolved and open issues per run; the issue table by status; the load log per source</w:t>
+            </w:r>
+          </w:p>
+        </w:tc>
+      </w:tr>
+    </w:tbl>
+    <w:p>
+      <w:pPr>
+        <w:spacing w:after="120"/>
+      </w:pPr>
+    </w:p>
+    <w:tbl>
+      <w:tblPr>
+        <w:tblW w:type="dxa" w:w="9360"/>
+        <w:tblBorders>
+          <w:top w:val="single" w:color="auto" w:sz="4"/>
+          <w:left w:val="single" w:color="auto" w:sz="4"/>
+          <w:bottom w:val="single" w:color="auto" w:sz="4"/>
+          <w:right w:val="single" w:color="auto" w:sz="4"/>
+          <w:insideH w:val="single" w:color="auto" w:sz="4"/>
+          <w:insideV w:val="single" w:color="auto" w:sz="4"/>
+        </w:tblBorders>
+      </w:tblPr>
+      <w:tblGrid>
+        <w:gridCol w:w="2000"/>
+        <w:gridCol w:w="2500"/>
+        <w:gridCol w:w="1100"/>
+        <w:gridCol w:w="3760"/>
+      </w:tblGrid>
+      <w:tr>
+        <w:trPr>
+          <w:cantSplit/>
+          <w:tblHeader/>
+        </w:trPr>
+        <w:tc>
+          <w:tcPr>
+            <w:tcW w:type="dxa" w:w="2000"/>
+            <w:shd w:fill="1F3864" w:val="clear"/>
+            <w:tcMar>
+              <w:top w:type="dxa" w:w="50"/>
+              <w:left w:type="dxa" w:w="90"/>
+              <w:bottom w:type="dxa" w:w="50"/>
+              <w:right w:type="dxa" w:w="90"/>
+            </w:tcMar>
+            <w:vAlign w:val="center"/>
+          </w:tcPr>
+          <w:p>
+            <w:pPr>
+              <w:jc w:val="left"/>
+            </w:pPr>
+            <w:r>
+              <w:rPr>
+                <w:b/>
+                <w:bCs/>
+                <w:color w:val="FFFFFF"/>
+                <w:sz w:val="16"/>
+                <w:szCs w:val="16"/>
+              </w:rPr>
+              <w:t xml:space="preserve">Reconciliation category</w:t>
+            </w:r>
+          </w:p>
+        </w:tc>
+        <w:tc>
+          <w:tcPr>
+            <w:tcW w:type="dxa" w:w="2500"/>
+            <w:shd w:fill="1F3864" w:val="clear"/>
+            <w:tcMar>
+              <w:top w:type="dxa" w:w="50"/>
+              <w:left w:type="dxa" w:w="90"/>
+              <w:bottom w:type="dxa" w:w="50"/>
+              <w:right w:type="dxa" w:w="90"/>
+            </w:tcMar>
+            <w:vAlign w:val="center"/>
+          </w:tcPr>
+          <w:p>
+            <w:pPr>
+              <w:jc w:val="left"/>
+            </w:pPr>
+            <w:r>
+              <w:rPr>
+                <w:b/>
+                <w:bCs/>
+                <w:color w:val="FFFFFF"/>
+                <w:sz w:val="16"/>
+                <w:szCs w:val="16"/>
+              </w:rPr>
+              <w:t xml:space="preserve">Employees</w:t>
+            </w:r>
+          </w:p>
+        </w:tc>
+        <w:tc>
+          <w:tcPr>
+            <w:tcW w:type="dxa" w:w="1100"/>
+            <w:shd w:fill="1F3864" w:val="clear"/>
+            <w:tcMar>
+              <w:top w:type="dxa" w:w="50"/>
+              <w:left w:type="dxa" w:w="90"/>
+              <w:bottom w:type="dxa" w:w="50"/>
+              <w:right w:type="dxa" w:w="90"/>
+            </w:tcMar>
+            <w:vAlign w:val="center"/>
+          </w:tcPr>
+          <w:p>
+            <w:pPr>
+              <w:jc w:val="left"/>
+            </w:pPr>
+            <w:r>
+              <w:rPr>
+                <w:b/>
+                <w:bCs/>
+                <w:color w:val="FFFFFF"/>
+                <w:sz w:val="16"/>
+                <w:szCs w:val="16"/>
+              </w:rPr>
+              <w:t xml:space="preserve">Counts as failure</w:t>
+            </w:r>
+          </w:p>
+        </w:tc>
+        <w:tc>
+          <w:tcPr>
+            <w:tcW w:type="dxa" w:w="3760"/>
+            <w:shd w:fill="1F3864" w:val="clear"/>
+            <w:tcMar>
+              <w:top w:type="dxa" w:w="50"/>
+              <w:left w:type="dxa" w:w="90"/>
+              <w:bottom w:type="dxa" w:w="50"/>
+              <w:right w:type="dxa" w:w="90"/>
+            </w:tcMar>
+            <w:vAlign w:val="center"/>
+          </w:tcPr>
+          <w:p>
+            <w:pPr>
+              <w:jc w:val="left"/>
+            </w:pPr>
+            <w:r>
+              <w:rPr>
+                <w:b/>
+                <w:bCs/>
+                <w:color w:val="FFFFFF"/>
+                <w:sz w:val="16"/>
+                <w:szCs w:val="16"/>
+              </w:rPr>
+              <w:t xml:space="preserve">Meaning</w:t>
+            </w:r>
+          </w:p>
+        </w:tc>
+      </w:tr>
+      <w:tr>
+        <w:trPr>
+          <w:cantSplit/>
+        </w:trPr>
+        <w:tc>
+          <w:tcPr>
+            <w:tcW w:type="dxa" w:w="2000"/>
+            <w:shd w:fill="FFFFFF" w:val="clear"/>
+            <w:tcMar>
+              <w:top w:type="dxa" w:w="50"/>
+              <w:left w:type="dxa" w:w="90"/>
+              <w:bottom w:type="dxa" w:w="50"/>
+              <w:right w:type="dxa" w:w="90"/>
+            </w:tcMar>
+            <w:vAlign w:val="center"/>
+          </w:tcPr>
+          <w:p>
+            <w:pPr>
+              <w:jc w:val="left"/>
+            </w:pPr>
+            <w:r>
+              <w:rPr>
+                <w:b w:val="false"/>
+                <w:bCs w:val="false"/>
+                <w:color w:val="000000"/>
+                <w:sz w:val="16"/>
+                <w:szCs w:val="16"/>
+              </w:rPr>
+              <w:t xml:space="preserve">Missing downstream</w:t>
+            </w:r>
+          </w:p>
+        </w:tc>
+        <w:tc>
+          <w:tcPr>
+            <w:tcW w:type="dxa" w:w="2500"/>
+            <w:shd w:fill="FFFFFF" w:val="clear"/>
+            <w:tcMar>
+              <w:top w:type="dxa" w:w="50"/>
+              <w:left w:type="dxa" w:w="90"/>
+              <w:bottom w:type="dxa" w:w="50"/>
+              <w:right w:type="dxa" w:w="90"/>
+            </w:tcMar>
+            <w:vAlign w:val="center"/>
+          </w:tcPr>
+          <w:p>
+            <w:pPr>
+              <w:jc w:val="left"/>
+            </w:pPr>
+            <w:r>
+              <w:rPr>
+                <w:b w:val="false"/>
+                <w:bCs w:val="false"/>
+                <w:color w:val="000000"/>
+                <w:sz w:val="16"/>
+                <w:szCs w:val="16"/>
+              </w:rPr>
+              <w:t xml:space="preserve">E1027</w:t>
+            </w:r>
+          </w:p>
+        </w:tc>
+        <w:tc>
+          <w:tcPr>
+            <w:tcW w:type="dxa" w:w="1100"/>
+            <w:shd w:fill="FFFFFF" w:val="clear"/>
+            <w:tcMar>
+              <w:top w:type="dxa" w:w="50"/>
+              <w:left w:type="dxa" w:w="90"/>
+              <w:bottom w:type="dxa" w:w="50"/>
+              <w:right w:type="dxa" w:w="90"/>
+            </w:tcMar>
+            <w:vAlign w:val="center"/>
+          </w:tcPr>
+          <w:p>
+            <w:pPr>
+              <w:jc w:val="left"/>
+            </w:pPr>
+            <w:r>
+              <w:rPr>
+                <w:b w:val="false"/>
+                <w:bCs w:val="false"/>
+                <w:color w:val="000000"/>
+                <w:sz w:val="16"/>
+                <w:szCs w:val="16"/>
+              </w:rPr>
+              <w:t xml:space="preserve">yes</w:t>
+            </w:r>
+          </w:p>
+        </w:tc>
+        <w:tc>
+          <w:tcPr>
+            <w:tcW w:type="dxa" w:w="3760"/>
+            <w:shd w:fill="FFFFFF" w:val="clear"/>
+            <w:tcMar>
+              <w:top w:type="dxa" w:w="50"/>
+              <w:left w:type="dxa" w:w="90"/>
+              <w:bottom w:type="dxa" w:w="50"/>
+              <w:right w:type="dxa" w:w="90"/>
+            </w:tcMar>
+            <w:vAlign w:val="center"/>
+          </w:tcPr>
+          <w:p>
+            <w:pPr>
+              <w:jc w:val="left"/>
+            </w:pPr>
+            <w:r>
+              <w:rPr>
+                <w:b w:val="false"/>
+                <w:bCs w:val="false"/>
+                <w:color w:val="000000"/>
+                <w:sz w:val="16"/>
+                <w:szCs w:val="16"/>
+              </w:rPr>
+              <w:t xml:space="preserve">In HR and payroll but missing from Employee 360 (RC01)</w:t>
+            </w:r>
+          </w:p>
+        </w:tc>
+      </w:tr>
+      <w:tr>
+        <w:trPr>
+          <w:cantSplit/>
+        </w:trPr>
+        <w:tc>
+          <w:tcPr>
+            <w:tcW w:type="dxa" w:w="2000"/>
+            <w:shd w:fill="F7F9FC" w:val="clear"/>
+            <w:tcMar>
+              <w:top w:type="dxa" w:w="50"/>
+              <w:left w:type="dxa" w:w="90"/>
+              <w:bottom w:type="dxa" w:w="50"/>
+              <w:right w:type="dxa" w:w="90"/>
+            </w:tcMar>
+            <w:vAlign w:val="center"/>
+          </w:tcPr>
+          <w:p>
+            <w:pPr>
+              <w:jc w:val="left"/>
+            </w:pPr>
+            <w:r>
+              <w:rPr>
+                <w:b w:val="false"/>
+                <w:bCs w:val="false"/>
+                <w:color w:val="000000"/>
+                <w:sz w:val="16"/>
+                <w:szCs w:val="16"/>
+              </w:rPr>
+              <w:t xml:space="preserve">Unexpected downstream</w:t>
+            </w:r>
+          </w:p>
+        </w:tc>
+        <w:tc>
+          <w:tcPr>
+            <w:tcW w:type="dxa" w:w="2500"/>
+            <w:shd w:fill="F7F9FC" w:val="clear"/>
+            <w:tcMar>
+              <w:top w:type="dxa" w:w="50"/>
+              <w:left w:type="dxa" w:w="90"/>
+              <w:bottom w:type="dxa" w:w="50"/>
+              <w:right w:type="dxa" w:w="90"/>
+            </w:tcMar>
+            <w:vAlign w:val="center"/>
+          </w:tcPr>
+          <w:p>
+            <w:pPr>
+              <w:jc w:val="left"/>
+            </w:pPr>
+            <w:r>
+              <w:rPr>
+                <w:b w:val="false"/>
+                <w:bCs w:val="false"/>
+                <w:color w:val="000000"/>
+                <w:sz w:val="16"/>
+                <w:szCs w:val="16"/>
+              </w:rPr>
+              <w:t xml:space="preserve">E1099</w:t>
+            </w:r>
+          </w:p>
+        </w:tc>
+        <w:tc>
+          <w:tcPr>
+            <w:tcW w:type="dxa" w:w="1100"/>
+            <w:shd w:fill="F7F9FC" w:val="clear"/>
+            <w:tcMar>
+              <w:top w:type="dxa" w:w="50"/>
+              <w:left w:type="dxa" w:w="90"/>
+              <w:bottom w:type="dxa" w:w="50"/>
+              <w:right w:type="dxa" w:w="90"/>
+            </w:tcMar>
+            <w:vAlign w:val="center"/>
+          </w:tcPr>
+          <w:p>
+            <w:pPr>
+              <w:jc w:val="left"/>
+            </w:pPr>
+            <w:r>
+              <w:rPr>
+                <w:b w:val="false"/>
+                <w:bCs w:val="false"/>
+                <w:color w:val="000000"/>
+                <w:sz w:val="16"/>
+                <w:szCs w:val="16"/>
+              </w:rPr>
+              <w:t xml:space="preserve">yes</w:t>
+            </w:r>
+          </w:p>
+        </w:tc>
+        <w:tc>
+          <w:tcPr>
+            <w:tcW w:type="dxa" w:w="3760"/>
+            <w:shd w:fill="F7F9FC" w:val="clear"/>
+            <w:tcMar>
+              <w:top w:type="dxa" w:w="50"/>
+              <w:left w:type="dxa" w:w="90"/>
+              <w:bottom w:type="dxa" w:w="50"/>
+              <w:right w:type="dxa" w:w="90"/>
+            </w:tcMar>
+            <w:vAlign w:val="center"/>
+          </w:tcPr>
+          <w:p>
+            <w:pPr>
+              <w:jc w:val="left"/>
+            </w:pPr>
+            <w:r>
+              <w:rPr>
+                <w:b w:val="false"/>
+                <w:bCs w:val="false"/>
+                <w:color w:val="000000"/>
+                <w:sz w:val="16"/>
+                <w:szCs w:val="16"/>
+              </w:rPr>
+              <w:t xml:space="preserve">In Employee 360 with no HR or payroll record (RC02)</w:t>
+            </w:r>
+          </w:p>
+        </w:tc>
+      </w:tr>
+      <w:tr>
+        <w:trPr>
+          <w:cantSplit/>
+        </w:trPr>
+        <w:tc>
+          <w:tcPr>
+            <w:tcW w:type="dxa" w:w="2000"/>
+            <w:shd w:fill="FFFFFF" w:val="clear"/>
+            <w:tcMar>
+              <w:top w:type="dxa" w:w="50"/>
+              <w:left w:type="dxa" w:w="90"/>
+              <w:bottom w:type="dxa" w:w="50"/>
+              <w:right w:type="dxa" w:w="90"/>
+            </w:tcMar>
+            <w:vAlign w:val="center"/>
+          </w:tcPr>
+          <w:p>
+            <w:pPr>
+              <w:jc w:val="left"/>
+            </w:pPr>
+            <w:r>
+              <w:rPr>
+                <w:b w:val="false"/>
+                <w:bCs w:val="false"/>
+                <w:color w:val="000000"/>
+                <w:sz w:val="16"/>
+                <w:szCs w:val="16"/>
+              </w:rPr>
+              <w:t xml:space="preserve">Field error</w:t>
+            </w:r>
+          </w:p>
+        </w:tc>
+        <w:tc>
+          <w:tcPr>
+            <w:tcW w:type="dxa" w:w="2500"/>
+            <w:shd w:fill="FFFFFF" w:val="clear"/>
+            <w:tcMar>
+              <w:top w:type="dxa" w:w="50"/>
+              <w:left w:type="dxa" w:w="90"/>
+              <w:bottom w:type="dxa" w:w="50"/>
+              <w:right w:type="dxa" w:w="90"/>
+            </w:tcMar>
+            <w:vAlign w:val="center"/>
+          </w:tcPr>
+          <w:p>
+            <w:pPr>
+              <w:jc w:val="left"/>
+            </w:pPr>
+            <w:r>
+              <w:rPr>
+                <w:b w:val="false"/>
+                <w:bCs w:val="false"/>
+                <w:color w:val="000000"/>
+                <w:sz w:val="16"/>
+                <w:szCs w:val="16"/>
+              </w:rPr>
+              <w:t xml:space="preserve">E1012, E1018, E1020, E1033, E1037, E1044</w:t>
+            </w:r>
+          </w:p>
+        </w:tc>
+        <w:tc>
+          <w:tcPr>
+            <w:tcW w:type="dxa" w:w="1100"/>
+            <w:shd w:fill="FFFFFF" w:val="clear"/>
+            <w:tcMar>
+              <w:top w:type="dxa" w:w="50"/>
+              <w:left w:type="dxa" w:w="90"/>
+              <w:bottom w:type="dxa" w:w="50"/>
+              <w:right w:type="dxa" w:w="90"/>
+            </w:tcMar>
+            <w:vAlign w:val="center"/>
+          </w:tcPr>
+          <w:p>
+            <w:pPr>
+              <w:jc w:val="left"/>
+            </w:pPr>
+            <w:r>
+              <w:rPr>
+                <w:b w:val="false"/>
+                <w:bCs w:val="false"/>
+                <w:color w:val="000000"/>
+                <w:sz w:val="16"/>
+                <w:szCs w:val="16"/>
+              </w:rPr>
+              <w:t xml:space="preserve">yes</w:t>
+            </w:r>
+          </w:p>
+        </w:tc>
+        <w:tc>
+          <w:tcPr>
+            <w:tcW w:type="dxa" w:w="3760"/>
+            <w:shd w:fill="FFFFFF" w:val="clear"/>
+            <w:tcMar>
+              <w:top w:type="dxa" w:w="50"/>
+              <w:left w:type="dxa" w:w="90"/>
+              <w:bottom w:type="dxa" w:w="50"/>
+              <w:right w:type="dxa" w:w="90"/>
+            </w:tcMar>
+            <w:vAlign w:val="center"/>
+          </w:tcPr>
+          <w:p>
+            <w:pPr>
+              <w:jc w:val="left"/>
+            </w:pPr>
+            <w:r>
+              <w:rPr>
+                <w:b w:val="false"/>
+                <w:bCs w:val="false"/>
+                <w:color w:val="000000"/>
+                <w:sz w:val="16"/>
+                <w:szCs w:val="16"/>
+              </w:rPr>
+              <w:t xml:space="preserve">Employee 360 differs from, or cannot be traced to, the system of record (RC03, RC04)</w:t>
+            </w:r>
+          </w:p>
+        </w:tc>
+      </w:tr>
+      <w:tr>
+        <w:trPr>
+          <w:cantSplit/>
+        </w:trPr>
+        <w:tc>
+          <w:tcPr>
+            <w:tcW w:type="dxa" w:w="2000"/>
+            <w:shd w:fill="F7F9FC" w:val="clear"/>
+            <w:tcMar>
+              <w:top w:type="dxa" w:w="50"/>
+              <w:left w:type="dxa" w:w="90"/>
+              <w:bottom w:type="dxa" w:w="50"/>
+              <w:right w:type="dxa" w:w="90"/>
+            </w:tcMar>
+            <w:vAlign w:val="center"/>
+          </w:tcPr>
+          <w:p>
+            <w:pPr>
+              <w:jc w:val="left"/>
+            </w:pPr>
+            <w:r>
+              <w:rPr>
+                <w:b w:val="false"/>
+                <w:bCs w:val="false"/>
+                <w:color w:val="000000"/>
+                <w:sz w:val="16"/>
+                <w:szCs w:val="16"/>
+              </w:rPr>
+              <w:t xml:space="preserve">Cannot verify</w:t>
+            </w:r>
+          </w:p>
+        </w:tc>
+        <w:tc>
+          <w:tcPr>
+            <w:tcW w:type="dxa" w:w="2500"/>
+            <w:shd w:fill="F7F9FC" w:val="clear"/>
+            <w:tcMar>
+              <w:top w:type="dxa" w:w="50"/>
+              <w:left w:type="dxa" w:w="90"/>
+              <w:bottom w:type="dxa" w:w="50"/>
+              <w:right w:type="dxa" w:w="90"/>
+            </w:tcMar>
+            <w:vAlign w:val="center"/>
+          </w:tcPr>
+          <w:p>
+            <w:pPr>
+              <w:jc w:val="left"/>
+            </w:pPr>
+            <w:r>
+              <w:rPr>
+                <w:b w:val="false"/>
+                <w:bCs w:val="false"/>
+                <w:color w:val="000000"/>
+                <w:sz w:val="16"/>
+                <w:szCs w:val="16"/>
+              </w:rPr>
+              <w:t xml:space="preserve">E1015</w:t>
+            </w:r>
+          </w:p>
+        </w:tc>
+        <w:tc>
+          <w:tcPr>
+            <w:tcW w:type="dxa" w:w="1100"/>
+            <w:shd w:fill="F7F9FC" w:val="clear"/>
+            <w:tcMar>
+              <w:top w:type="dxa" w:w="50"/>
+              <w:left w:type="dxa" w:w="90"/>
+              <w:bottom w:type="dxa" w:w="50"/>
+              <w:right w:type="dxa" w:w="90"/>
+            </w:tcMar>
+            <w:vAlign w:val="center"/>
+          </w:tcPr>
+          <w:p>
+            <w:pPr>
+              <w:jc w:val="left"/>
+            </w:pPr>
+            <w:r>
+              <w:rPr>
+                <w:b w:val="false"/>
+                <w:bCs w:val="false"/>
+                <w:color w:val="000000"/>
+                <w:sz w:val="16"/>
+                <w:szCs w:val="16"/>
+              </w:rPr>
+              <w:t xml:space="preserve">yes</w:t>
+            </w:r>
+          </w:p>
+        </w:tc>
+        <w:tc>
+          <w:tcPr>
+            <w:tcW w:type="dxa" w:w="3760"/>
+            <w:shd w:fill="F7F9FC" w:val="clear"/>
+            <w:tcMar>
+              <w:top w:type="dxa" w:w="50"/>
+              <w:left w:type="dxa" w:w="90"/>
+              <w:bottom w:type="dxa" w:w="50"/>
+              <w:right w:type="dxa" w:w="90"/>
+            </w:tcMar>
+            <w:vAlign w:val="center"/>
+          </w:tcPr>
+          <w:p>
+            <w:pPr>
+              <w:jc w:val="left"/>
+            </w:pPr>
+            <w:r>
+              <w:rPr>
+                <w:b w:val="false"/>
+                <w:bCs w:val="false"/>
+                <w:color w:val="000000"/>
+                <w:sz w:val="16"/>
+                <w:szCs w:val="16"/>
+              </w:rPr>
+              <w:t xml:space="preserve">The system of record is ambiguous, so the Employee 360 value cannot be verified (RC03)</w:t>
+            </w:r>
+          </w:p>
+        </w:tc>
+      </w:tr>
+      <w:tr>
+        <w:trPr>
+          <w:cantSplit/>
+        </w:trPr>
+        <w:tc>
+          <w:tcPr>
+            <w:tcW w:type="dxa" w:w="2000"/>
+            <w:shd w:fill="FFFFFF" w:val="clear"/>
+            <w:tcMar>
+              <w:top w:type="dxa" w:w="50"/>
+              <w:left w:type="dxa" w:w="90"/>
+              <w:bottom w:type="dxa" w:w="50"/>
+              <w:right w:type="dxa" w:w="90"/>
+            </w:tcMar>
+            <w:vAlign w:val="center"/>
+          </w:tcPr>
+          <w:p>
+            <w:pPr>
+              <w:jc w:val="left"/>
+            </w:pPr>
+            <w:r>
+              <w:rPr>
+                <w:b w:val="false"/>
+                <w:bCs w:val="false"/>
+                <w:color w:val="000000"/>
+                <w:sz w:val="16"/>
+                <w:szCs w:val="16"/>
+              </w:rPr>
+              <w:t xml:space="preserve">Legitimate exception</w:t>
+            </w:r>
+          </w:p>
+        </w:tc>
+        <w:tc>
+          <w:tcPr>
+            <w:tcW w:type="dxa" w:w="2500"/>
+            <w:shd w:fill="FFFFFF" w:val="clear"/>
+            <w:tcMar>
+              <w:top w:type="dxa" w:w="50"/>
+              <w:left w:type="dxa" w:w="90"/>
+              <w:bottom w:type="dxa" w:w="50"/>
+              <w:right w:type="dxa" w:w="90"/>
+            </w:tcMar>
+            <w:vAlign w:val="center"/>
+          </w:tcPr>
+          <w:p>
+            <w:pPr>
+              <w:jc w:val="left"/>
+            </w:pPr>
+            <w:r>
+              <w:rPr>
+                <w:b w:val="false"/>
+                <w:bCs w:val="false"/>
+                <w:color w:val="000000"/>
+                <w:sz w:val="16"/>
+                <w:szCs w:val="16"/>
+              </w:rPr>
+              <w:t xml:space="preserve">E1042</w:t>
+            </w:r>
+          </w:p>
+        </w:tc>
+        <w:tc>
+          <w:tcPr>
+            <w:tcW w:type="dxa" w:w="1100"/>
+            <w:shd w:fill="FFFFFF" w:val="clear"/>
+            <w:tcMar>
+              <w:top w:type="dxa" w:w="50"/>
+              <w:left w:type="dxa" w:w="90"/>
+              <w:bottom w:type="dxa" w:w="50"/>
+              <w:right w:type="dxa" w:w="90"/>
+            </w:tcMar>
+            <w:vAlign w:val="center"/>
+          </w:tcPr>
+          <w:p>
+            <w:pPr>
+              <w:jc w:val="left"/>
+            </w:pPr>
+            <w:r>
+              <w:rPr>
+                <w:b w:val="false"/>
+                <w:bCs w:val="false"/>
+                <w:color w:val="000000"/>
+                <w:sz w:val="16"/>
+                <w:szCs w:val="16"/>
+              </w:rPr>
+              <w:t xml:space="preserve">no</w:t>
+            </w:r>
+          </w:p>
+        </w:tc>
+        <w:tc>
+          <w:tcPr>
+            <w:tcW w:type="dxa" w:w="3760"/>
+            <w:shd w:fill="FFFFFF" w:val="clear"/>
+            <w:tcMar>
+              <w:top w:type="dxa" w:w="50"/>
+              <w:left w:type="dxa" w:w="90"/>
+              <w:bottom w:type="dxa" w:w="50"/>
+              <w:right w:type="dxa" w:w="90"/>
+            </w:tcMar>
+            <w:vAlign w:val="center"/>
+          </w:tcPr>
+          <w:p>
+            <w:pPr>
+              <w:jc w:val="left"/>
+            </w:pPr>
+            <w:r>
+              <w:rPr>
+                <w:b w:val="false"/>
+                <w:bCs w:val="false"/>
+                <w:color w:val="000000"/>
+                <w:sz w:val="16"/>
+                <w:szCs w:val="16"/>
+              </w:rPr>
+              <w:t xml:space="preserve">A difference that is correct (e.g. a future-dated HR change); shown for transparency, does not count as a failure or block release</w:t>
+            </w:r>
+          </w:p>
+        </w:tc>
+      </w:tr>
+    </w:tbl>
+    <w:p>
+      <w:pPr>
+        <w:spacing w:after="120"/>
+      </w:pPr>
+    </w:p>
+    <w:tbl>
+      <w:tblPr>
+        <w:tblW w:type="dxa" w:w="9360"/>
+        <w:tblBorders>
+          <w:top w:val="single" w:color="auto" w:sz="4"/>
+          <w:left w:val="single" w:color="auto" w:sz="4"/>
+          <w:bottom w:val="single" w:color="auto" w:sz="4"/>
+          <w:right w:val="single" w:color="auto" w:sz="4"/>
+          <w:insideH w:val="single" w:color="auto" w:sz="4"/>
+          <w:insideV w:val="single" w:color="auto" w:sz="4"/>
+        </w:tblBorders>
+      </w:tblPr>
+      <w:tblGrid>
+        <w:gridCol w:w="9360"/>
+      </w:tblGrid>
+      <w:tr>
+        <w:tc>
+          <w:tcPr>
+            <w:tcW w:type="dxa" w:w="9360"/>
+            <w:tcBorders>
+              <w:top w:val="single" w:color="1F3864" w:sz="6"/>
+              <w:left w:val="single" w:color="1F3864" w:sz="6"/>
+              <w:bottom w:val="single" w:color="1F3864" w:sz="6"/>
+              <w:right w:val="single" w:color="1F3864" w:sz="6"/>
+            </w:tcBorders>
+            <w:shd w:fill="EEF3F8" w:val="clear"/>
+            <w:tcMar>
+              <w:top w:type="dxa" w:w="120"/>
+              <w:left w:type="dxa" w:w="180"/>
+              <w:bottom w:type="dxa" w:w="120"/>
+              <w:right w:type="dxa" w:w="180"/>
+            </w:tcMar>
+          </w:tcPr>
+          <w:p>
+            <w:pPr>
+              <w:spacing w:after="80"/>
+            </w:pPr>
+            <w:r>
+              <w:rPr>
+                <w:b/>
+                <w:bCs/>
+                <w:color w:val="1F3864"/>
+                <w:sz w:val="21"/>
+                <w:szCs w:val="21"/>
+              </w:rPr>
+              <w:t xml:space="preserve">Access: private to the owner</w:t>
+            </w:r>
+          </w:p>
+          <w:p>
+            <w:pPr>
+              <w:pStyle w:val="ListParagraph"/>
+              <w:numPr>
+                <w:ilvl w:val="0"/>
+                <w:numId w:val="2"/>
+              </w:numPr>
+              <w:spacing w:after="50"/>
+            </w:pPr>
+            <w:r>
+              <w:t xml:space="preserve">Owner-only (plus the workspace admins group, which on this workspace is the same person); no shares, no public or embed links, no schedules or subscriptions.</w:t>
+            </w:r>
+          </w:p>
+          <w:p>
+            <w:pPr>
+              <w:pStyle w:val="ListParagraph"/>
+              <w:numPr>
+                <w:ilvl w:val="0"/>
+                <w:numId w:val="2"/>
+              </w:numPr>
+              <w:spacing w:after="50"/>
+            </w:pPr>
+            <w:r>
+              <w:t xml:space="preserve">Published with embedded credentials off, so anyone ever given access would still need their own grant on the tables. Evidence: evidence/databricks_dashboard.md.</w:t>
+            </w:r>
+          </w:p>
+        </w:tc>
+      </w:tr>
+    </w:tbl>
+    <w:p>
+      <w:pPr>
         <w:pStyle w:val="Heading1"/>
         <w:pageBreakBefore/>
         <w:spacing w:after="160"/>
@@ -21258,6 +23233,586 @@
                 <w:szCs w:val="15"/>
               </w:rPr>
               <w:t xml:space="preserve">6d9d54ac51da5bf6</w:t>
+            </w:r>
+          </w:p>
+        </w:tc>
+      </w:tr>
+      <w:tr>
+        <w:trPr>
+          <w:cantSplit/>
+        </w:trPr>
+        <w:tc>
+          <w:tcPr>
+            <w:tcW w:type="dxa" w:w="600"/>
+            <w:shd w:fill="F7F9FC" w:val="clear"/>
+            <w:tcMar>
+              <w:top w:type="dxa" w:w="50"/>
+              <w:left w:type="dxa" w:w="90"/>
+              <w:bottom w:type="dxa" w:w="50"/>
+              <w:right w:type="dxa" w:w="90"/>
+            </w:tcMar>
+            <w:vAlign w:val="center"/>
+          </w:tcPr>
+          <w:p>
+            <w:pPr>
+              <w:jc w:val="left"/>
+            </w:pPr>
+            <w:r>
+              <w:rPr>
+                <w:b w:val="false"/>
+                <w:bCs w:val="false"/>
+                <w:color w:val="000000"/>
+                <w:sz w:val="15"/>
+                <w:szCs w:val="15"/>
+              </w:rPr>
+              <w:t xml:space="preserve">10</w:t>
+            </w:r>
+          </w:p>
+        </w:tc>
+        <w:tc>
+          <w:tcPr>
+            <w:tcW w:type="dxa" w:w="2300"/>
+            <w:shd w:fill="F7F9FC" w:val="clear"/>
+            <w:tcMar>
+              <w:top w:type="dxa" w:w="50"/>
+              <w:left w:type="dxa" w:w="90"/>
+              <w:bottom w:type="dxa" w:w="50"/>
+              <w:right w:type="dxa" w:w="90"/>
+            </w:tcMar>
+            <w:vAlign w:val="center"/>
+          </w:tcPr>
+          <w:p>
+            <w:pPr>
+              <w:jc w:val="left"/>
+            </w:pPr>
+            <w:r>
+              <w:rPr>
+                <w:b w:val="false"/>
+                <w:bCs w:val="false"/>
+                <w:color w:val="000000"/>
+                <w:sz w:val="15"/>
+                <w:szCs w:val="15"/>
+              </w:rPr>
+              <w:t xml:space="preserve">databricks_run1_monitoring.png</w:t>
+            </w:r>
+          </w:p>
+        </w:tc>
+        <w:tc>
+          <w:tcPr>
+            <w:tcW w:type="dxa" w:w="1500"/>
+            <w:shd w:fill="F7F9FC" w:val="clear"/>
+            <w:tcMar>
+              <w:top w:type="dxa" w:w="50"/>
+              <w:left w:type="dxa" w:w="90"/>
+              <w:bottom w:type="dxa" w:w="50"/>
+              <w:right w:type="dxa" w:w="90"/>
+            </w:tcMar>
+            <w:vAlign w:val="center"/>
+          </w:tcPr>
+          <w:p>
+            <w:pPr>
+              <w:jc w:val="left"/>
+            </w:pPr>
+            <w:r>
+              <w:rPr>
+                <w:b w:val="false"/>
+                <w:bCs w:val="false"/>
+                <w:color w:val="000000"/>
+                <w:sz w:val="15"/>
+                <w:szCs w:val="15"/>
+              </w:rPr>
+              <w:t xml:space="preserve">Databricks run export (rendered, not a browser screenshot)</w:t>
+            </w:r>
+          </w:p>
+        </w:tc>
+        <w:tc>
+          <w:tcPr>
+            <w:tcW w:type="dxa" w:w="3260"/>
+            <w:shd w:fill="F7F9FC" w:val="clear"/>
+            <w:tcMar>
+              <w:top w:type="dxa" w:w="50"/>
+              <w:left w:type="dxa" w:w="90"/>
+              <w:bottom w:type="dxa" w:w="50"/>
+              <w:right w:type="dxa" w:w="90"/>
+            </w:tcMar>
+            <w:vAlign w:val="center"/>
+          </w:tcPr>
+          <w:p>
+            <w:pPr>
+              <w:jc w:val="left"/>
+            </w:pPr>
+            <w:r>
+              <w:rPr>
+                <w:b w:val="false"/>
+                <w:bCs w:val="false"/>
+                <w:color w:val="000000"/>
+                <w:sz w:val="15"/>
+                <w:szCs w:val="15"/>
+              </w:rPr>
+              <w:t xml:space="preserve">evidence/databricks_exports/</w:t>
+            </w:r>
+          </w:p>
+        </w:tc>
+        <w:tc>
+          <w:tcPr>
+            <w:tcW w:type="dxa" w:w="1700"/>
+            <w:shd w:fill="F7F9FC" w:val="clear"/>
+            <w:tcMar>
+              <w:top w:type="dxa" w:w="50"/>
+              <w:left w:type="dxa" w:w="90"/>
+              <w:bottom w:type="dxa" w:w="50"/>
+              <w:right w:type="dxa" w:w="90"/>
+            </w:tcMar>
+            <w:vAlign w:val="center"/>
+          </w:tcPr>
+          <w:p>
+            <w:pPr>
+              <w:jc w:val="left"/>
+            </w:pPr>
+            <w:r>
+              <w:rPr>
+                <w:b w:val="false"/>
+                <w:bCs w:val="false"/>
+                <w:color w:val="000000"/>
+                <w:sz w:val="15"/>
+                <w:szCs w:val="15"/>
+              </w:rPr>
+              <w:t xml:space="preserve">2d221abca7ae49fb</w:t>
+            </w:r>
+          </w:p>
+        </w:tc>
+      </w:tr>
+      <w:tr>
+        <w:trPr>
+          <w:cantSplit/>
+        </w:trPr>
+        <w:tc>
+          <w:tcPr>
+            <w:tcW w:type="dxa" w:w="600"/>
+            <w:shd w:fill="FFFFFF" w:val="clear"/>
+            <w:tcMar>
+              <w:top w:type="dxa" w:w="50"/>
+              <w:left w:type="dxa" w:w="90"/>
+              <w:bottom w:type="dxa" w:w="50"/>
+              <w:right w:type="dxa" w:w="90"/>
+            </w:tcMar>
+            <w:vAlign w:val="center"/>
+          </w:tcPr>
+          <w:p>
+            <w:pPr>
+              <w:jc w:val="left"/>
+            </w:pPr>
+            <w:r>
+              <w:rPr>
+                <w:b w:val="false"/>
+                <w:bCs w:val="false"/>
+                <w:color w:val="000000"/>
+                <w:sz w:val="15"/>
+                <w:szCs w:val="15"/>
+              </w:rPr>
+              <w:t xml:space="preserve">11</w:t>
+            </w:r>
+          </w:p>
+        </w:tc>
+        <w:tc>
+          <w:tcPr>
+            <w:tcW w:type="dxa" w:w="2300"/>
+            <w:shd w:fill="FFFFFF" w:val="clear"/>
+            <w:tcMar>
+              <w:top w:type="dxa" w:w="50"/>
+              <w:left w:type="dxa" w:w="90"/>
+              <w:bottom w:type="dxa" w:w="50"/>
+              <w:right w:type="dxa" w:w="90"/>
+            </w:tcMar>
+            <w:vAlign w:val="center"/>
+          </w:tcPr>
+          <w:p>
+            <w:pPr>
+              <w:jc w:val="left"/>
+            </w:pPr>
+            <w:r>
+              <w:rPr>
+                <w:b w:val="false"/>
+                <w:bCs w:val="false"/>
+                <w:color w:val="000000"/>
+                <w:sz w:val="15"/>
+                <w:szCs w:val="15"/>
+              </w:rPr>
+              <w:t xml:space="preserve">databricks_run1_gold.png</w:t>
+            </w:r>
+          </w:p>
+        </w:tc>
+        <w:tc>
+          <w:tcPr>
+            <w:tcW w:type="dxa" w:w="1500"/>
+            <w:shd w:fill="FFFFFF" w:val="clear"/>
+            <w:tcMar>
+              <w:top w:type="dxa" w:w="50"/>
+              <w:left w:type="dxa" w:w="90"/>
+              <w:bottom w:type="dxa" w:w="50"/>
+              <w:right w:type="dxa" w:w="90"/>
+            </w:tcMar>
+            <w:vAlign w:val="center"/>
+          </w:tcPr>
+          <w:p>
+            <w:pPr>
+              <w:jc w:val="left"/>
+            </w:pPr>
+            <w:r>
+              <w:rPr>
+                <w:b w:val="false"/>
+                <w:bCs w:val="false"/>
+                <w:color w:val="000000"/>
+                <w:sz w:val="15"/>
+                <w:szCs w:val="15"/>
+              </w:rPr>
+              <w:t xml:space="preserve">Databricks run export (rendered, not a browser screenshot)</w:t>
+            </w:r>
+          </w:p>
+        </w:tc>
+        <w:tc>
+          <w:tcPr>
+            <w:tcW w:type="dxa" w:w="3260"/>
+            <w:shd w:fill="FFFFFF" w:val="clear"/>
+            <w:tcMar>
+              <w:top w:type="dxa" w:w="50"/>
+              <w:left w:type="dxa" w:w="90"/>
+              <w:bottom w:type="dxa" w:w="50"/>
+              <w:right w:type="dxa" w:w="90"/>
+            </w:tcMar>
+            <w:vAlign w:val="center"/>
+          </w:tcPr>
+          <w:p>
+            <w:pPr>
+              <w:jc w:val="left"/>
+            </w:pPr>
+            <w:r>
+              <w:rPr>
+                <w:b w:val="false"/>
+                <w:bCs w:val="false"/>
+                <w:color w:val="000000"/>
+                <w:sz w:val="15"/>
+                <w:szCs w:val="15"/>
+              </w:rPr>
+              <w:t xml:space="preserve">evidence/databricks_exports/</w:t>
+            </w:r>
+          </w:p>
+        </w:tc>
+        <w:tc>
+          <w:tcPr>
+            <w:tcW w:type="dxa" w:w="1700"/>
+            <w:shd w:fill="FFFFFF" w:val="clear"/>
+            <w:tcMar>
+              <w:top w:type="dxa" w:w="50"/>
+              <w:left w:type="dxa" w:w="90"/>
+              <w:bottom w:type="dxa" w:w="50"/>
+              <w:right w:type="dxa" w:w="90"/>
+            </w:tcMar>
+            <w:vAlign w:val="center"/>
+          </w:tcPr>
+          <w:p>
+            <w:pPr>
+              <w:jc w:val="left"/>
+            </w:pPr>
+            <w:r>
+              <w:rPr>
+                <w:b w:val="false"/>
+                <w:bCs w:val="false"/>
+                <w:color w:val="000000"/>
+                <w:sz w:val="15"/>
+                <w:szCs w:val="15"/>
+              </w:rPr>
+              <w:t xml:space="preserve">3732076c0519fe07</w:t>
+            </w:r>
+          </w:p>
+        </w:tc>
+      </w:tr>
+      <w:tr>
+        <w:trPr>
+          <w:cantSplit/>
+        </w:trPr>
+        <w:tc>
+          <w:tcPr>
+            <w:tcW w:type="dxa" w:w="600"/>
+            <w:shd w:fill="F7F9FC" w:val="clear"/>
+            <w:tcMar>
+              <w:top w:type="dxa" w:w="50"/>
+              <w:left w:type="dxa" w:w="90"/>
+              <w:bottom w:type="dxa" w:w="50"/>
+              <w:right w:type="dxa" w:w="90"/>
+            </w:tcMar>
+            <w:vAlign w:val="center"/>
+          </w:tcPr>
+          <w:p>
+            <w:pPr>
+              <w:jc w:val="left"/>
+            </w:pPr>
+            <w:r>
+              <w:rPr>
+                <w:b w:val="false"/>
+                <w:bCs w:val="false"/>
+                <w:color w:val="000000"/>
+                <w:sz w:val="15"/>
+                <w:szCs w:val="15"/>
+              </w:rPr>
+              <w:t xml:space="preserve">12</w:t>
+            </w:r>
+          </w:p>
+        </w:tc>
+        <w:tc>
+          <w:tcPr>
+            <w:tcW w:type="dxa" w:w="2300"/>
+            <w:shd w:fill="F7F9FC" w:val="clear"/>
+            <w:tcMar>
+              <w:top w:type="dxa" w:w="50"/>
+              <w:left w:type="dxa" w:w="90"/>
+              <w:bottom w:type="dxa" w:w="50"/>
+              <w:right w:type="dxa" w:w="90"/>
+            </w:tcMar>
+            <w:vAlign w:val="center"/>
+          </w:tcPr>
+          <w:p>
+            <w:pPr>
+              <w:jc w:val="left"/>
+            </w:pPr>
+            <w:r>
+              <w:rPr>
+                <w:b w:val="false"/>
+                <w:bCs w:val="false"/>
+                <w:color w:val="000000"/>
+                <w:sz w:val="15"/>
+                <w:szCs w:val="15"/>
+              </w:rPr>
+              <w:t xml:space="preserve">databricks_run2_skipped.png</w:t>
+            </w:r>
+          </w:p>
+        </w:tc>
+        <w:tc>
+          <w:tcPr>
+            <w:tcW w:type="dxa" w:w="1500"/>
+            <w:shd w:fill="F7F9FC" w:val="clear"/>
+            <w:tcMar>
+              <w:top w:type="dxa" w:w="50"/>
+              <w:left w:type="dxa" w:w="90"/>
+              <w:bottom w:type="dxa" w:w="50"/>
+              <w:right w:type="dxa" w:w="90"/>
+            </w:tcMar>
+            <w:vAlign w:val="center"/>
+          </w:tcPr>
+          <w:p>
+            <w:pPr>
+              <w:jc w:val="left"/>
+            </w:pPr>
+            <w:r>
+              <w:rPr>
+                <w:b w:val="false"/>
+                <w:bCs w:val="false"/>
+                <w:color w:val="000000"/>
+                <w:sz w:val="15"/>
+                <w:szCs w:val="15"/>
+              </w:rPr>
+              <w:t xml:space="preserve">Databricks run export (rendered, not a browser screenshot)</w:t>
+            </w:r>
+          </w:p>
+        </w:tc>
+        <w:tc>
+          <w:tcPr>
+            <w:tcW w:type="dxa" w:w="3260"/>
+            <w:shd w:fill="F7F9FC" w:val="clear"/>
+            <w:tcMar>
+              <w:top w:type="dxa" w:w="50"/>
+              <w:left w:type="dxa" w:w="90"/>
+              <w:bottom w:type="dxa" w:w="50"/>
+              <w:right w:type="dxa" w:w="90"/>
+            </w:tcMar>
+            <w:vAlign w:val="center"/>
+          </w:tcPr>
+          <w:p>
+            <w:pPr>
+              <w:jc w:val="left"/>
+            </w:pPr>
+            <w:r>
+              <w:rPr>
+                <w:b w:val="false"/>
+                <w:bCs w:val="false"/>
+                <w:color w:val="000000"/>
+                <w:sz w:val="15"/>
+                <w:szCs w:val="15"/>
+              </w:rPr>
+              <w:t xml:space="preserve">evidence/databricks_exports/</w:t>
+            </w:r>
+          </w:p>
+        </w:tc>
+        <w:tc>
+          <w:tcPr>
+            <w:tcW w:type="dxa" w:w="1700"/>
+            <w:shd w:fill="F7F9FC" w:val="clear"/>
+            <w:tcMar>
+              <w:top w:type="dxa" w:w="50"/>
+              <w:left w:type="dxa" w:w="90"/>
+              <w:bottom w:type="dxa" w:w="50"/>
+              <w:right w:type="dxa" w:w="90"/>
+            </w:tcMar>
+            <w:vAlign w:val="center"/>
+          </w:tcPr>
+          <w:p>
+            <w:pPr>
+              <w:jc w:val="left"/>
+            </w:pPr>
+            <w:r>
+              <w:rPr>
+                <w:b w:val="false"/>
+                <w:bCs w:val="false"/>
+                <w:color w:val="000000"/>
+                <w:sz w:val="15"/>
+                <w:szCs w:val="15"/>
+              </w:rPr>
+              <w:t xml:space="preserve">ff8036048942d98c</w:t>
+            </w:r>
+          </w:p>
+        </w:tc>
+      </w:tr>
+      <w:tr>
+        <w:trPr>
+          <w:cantSplit/>
+        </w:trPr>
+        <w:tc>
+          <w:tcPr>
+            <w:tcW w:type="dxa" w:w="600"/>
+            <w:shd w:fill="FFFFFF" w:val="clear"/>
+            <w:tcMar>
+              <w:top w:type="dxa" w:w="50"/>
+              <w:left w:type="dxa" w:w="90"/>
+              <w:bottom w:type="dxa" w:w="50"/>
+              <w:right w:type="dxa" w:w="90"/>
+            </w:tcMar>
+            <w:vAlign w:val="center"/>
+          </w:tcPr>
+          <w:p>
+            <w:pPr>
+              <w:jc w:val="left"/>
+            </w:pPr>
+            <w:r>
+              <w:rPr>
+                <w:b w:val="false"/>
+                <w:bCs w:val="false"/>
+                <w:color w:val="000000"/>
+                <w:sz w:val="15"/>
+                <w:szCs w:val="15"/>
+              </w:rPr>
+              <w:t xml:space="preserve">13</w:t>
+            </w:r>
+          </w:p>
+        </w:tc>
+        <w:tc>
+          <w:tcPr>
+            <w:tcW w:type="dxa" w:w="2300"/>
+            <w:shd w:fill="FFFFFF" w:val="clear"/>
+            <w:tcMar>
+              <w:top w:type="dxa" w:w="50"/>
+              <w:left w:type="dxa" w:w="90"/>
+              <w:bottom w:type="dxa" w:w="50"/>
+              <w:right w:type="dxa" w:w="90"/>
+            </w:tcMar>
+            <w:vAlign w:val="center"/>
+          </w:tcPr>
+          <w:p>
+            <w:pPr>
+              <w:jc w:val="left"/>
+            </w:pPr>
+            <w:r>
+              <w:rPr>
+                <w:b w:val="false"/>
+                <w:bCs w:val="false"/>
+                <w:color w:val="000000"/>
+                <w:sz w:val="15"/>
+                <w:szCs w:val="15"/>
+              </w:rPr>
+              <w:t xml:space="preserve">databricks_run3_new_issues.png</w:t>
+            </w:r>
+          </w:p>
+        </w:tc>
+        <w:tc>
+          <w:tcPr>
+            <w:tcW w:type="dxa" w:w="1500"/>
+            <w:shd w:fill="FFFFFF" w:val="clear"/>
+            <w:tcMar>
+              <w:top w:type="dxa" w:w="50"/>
+              <w:left w:type="dxa" w:w="90"/>
+              <w:bottom w:type="dxa" w:w="50"/>
+              <w:right w:type="dxa" w:w="90"/>
+            </w:tcMar>
+            <w:vAlign w:val="center"/>
+          </w:tcPr>
+          <w:p>
+            <w:pPr>
+              <w:jc w:val="left"/>
+            </w:pPr>
+            <w:r>
+              <w:rPr>
+                <w:b w:val="false"/>
+                <w:bCs w:val="false"/>
+                <w:color w:val="000000"/>
+                <w:sz w:val="15"/>
+                <w:szCs w:val="15"/>
+              </w:rPr>
+              <w:t xml:space="preserve">Databricks run export (rendered, not a browser screenshot)</w:t>
+            </w:r>
+          </w:p>
+        </w:tc>
+        <w:tc>
+          <w:tcPr>
+            <w:tcW w:type="dxa" w:w="3260"/>
+            <w:shd w:fill="FFFFFF" w:val="clear"/>
+            <w:tcMar>
+              <w:top w:type="dxa" w:w="50"/>
+              <w:left w:type="dxa" w:w="90"/>
+              <w:bottom w:type="dxa" w:w="50"/>
+              <w:right w:type="dxa" w:w="90"/>
+            </w:tcMar>
+            <w:vAlign w:val="center"/>
+          </w:tcPr>
+          <w:p>
+            <w:pPr>
+              <w:jc w:val="left"/>
+            </w:pPr>
+            <w:r>
+              <w:rPr>
+                <w:b w:val="false"/>
+                <w:bCs w:val="false"/>
+                <w:color w:val="000000"/>
+                <w:sz w:val="15"/>
+                <w:szCs w:val="15"/>
+              </w:rPr>
+              <w:t xml:space="preserve">evidence/databricks_exports/</w:t>
+            </w:r>
+          </w:p>
+        </w:tc>
+        <w:tc>
+          <w:tcPr>
+            <w:tcW w:type="dxa" w:w="1700"/>
+            <w:shd w:fill="FFFFFF" w:val="clear"/>
+            <w:tcMar>
+              <w:top w:type="dxa" w:w="50"/>
+              <w:left w:type="dxa" w:w="90"/>
+              <w:bottom w:type="dxa" w:w="50"/>
+              <w:right w:type="dxa" w:w="90"/>
+            </w:tcMar>
+            <w:vAlign w:val="center"/>
+          </w:tcPr>
+          <w:p>
+            <w:pPr>
+              <w:jc w:val="left"/>
+            </w:pPr>
+            <w:r>
+              <w:rPr>
+                <w:b w:val="false"/>
+                <w:bCs w:val="false"/>
+                <w:color w:val="000000"/>
+                <w:sz w:val="15"/>
+                <w:szCs w:val="15"/>
+              </w:rPr>
+              <w:t xml:space="preserve">f30e927f352ca320</w:t>
             </w:r>
           </w:p>
         </w:tc>

</xml_diff>

<commit_message>
eBook: genuine dashboard screenshots (pages 1-2) as captures; evidence of crops
Five candidate-taken screenshots of the private dashboard, pixel-cropped to the app
area (no browser tabs or notifications). Crop boxes and SHA-256 of originals and
crops in evidence/dashboard_screenshots.md. eBook rebuilt (22 pages).

Co-Authored-By: Claude Opus 5.5 <noreply@anthropic.com>
Claude-Session: https://claude.ai/code/session_01GpY9vtVnSw1tgz3K4xTp8Q
</commit_message>
<xml_diff>
--- a/inference-data-qa/Employee360_DQ_eBook.docx
+++ b/inference-data-qa/Employee360_DQ_eBook.docx
@@ -2103,7 +2103,7 @@
                 <w:sz w:val="18"/>
                 <w:szCs w:val="18"/>
               </w:rPr>
-              <w:t xml:space="preserve">18</w:t>
+              <w:t xml:space="preserve">20</w:t>
             </w:r>
           </w:p>
         </w:tc>
@@ -2192,7 +2192,7 @@
                 <w:sz w:val="18"/>
                 <w:szCs w:val="18"/>
               </w:rPr>
-              <w:t xml:space="preserve">19</w:t>
+              <w:t xml:space="preserve">21</w:t>
             </w:r>
           </w:p>
         </w:tc>
@@ -2281,7 +2281,7 @@
                 <w:sz w:val="18"/>
                 <w:szCs w:val="18"/>
               </w:rPr>
-              <w:t xml:space="preserve">20</w:t>
+              <w:t xml:space="preserve">22</w:t>
             </w:r>
           </w:p>
         </w:tc>
@@ -3560,7 +3560,7 @@
                 <w:sz w:val="16"/>
                 <w:szCs w:val="16"/>
               </w:rPr>
-              <w:t xml:space="preserve">7, 19</w:t>
+              <w:t xml:space="preserve">7, 21</w:t>
             </w:r>
           </w:p>
         </w:tc>
@@ -5081,7 +5081,7 @@
                 <w:sz w:val="16"/>
                 <w:szCs w:val="16"/>
               </w:rPr>
-              <w:t xml:space="preserve">18</w:t>
+              <w:t xml:space="preserve">20</w:t>
             </w:r>
           </w:p>
         </w:tc>
@@ -5198,7 +5198,7 @@
                 <w:sz w:val="16"/>
                 <w:szCs w:val="16"/>
               </w:rPr>
-              <w:t xml:space="preserve">18</w:t>
+              <w:t xml:space="preserve">20</w:t>
             </w:r>
           </w:p>
         </w:tc>
@@ -5315,7 +5315,7 @@
                 <w:sz w:val="16"/>
                 <w:szCs w:val="16"/>
               </w:rPr>
-              <w:t xml:space="preserve">18</w:t>
+              <w:t xml:space="preserve">20</w:t>
             </w:r>
           </w:p>
         </w:tc>
@@ -5432,7 +5432,7 @@
                 <w:sz w:val="16"/>
                 <w:szCs w:val="16"/>
               </w:rPr>
-              <w:t xml:space="preserve">19</w:t>
+              <w:t xml:space="preserve">21</w:t>
             </w:r>
           </w:p>
         </w:tc>
@@ -20880,6 +20880,369 @@
     </w:tbl>
     <w:p>
       <w:pPr>
+        <w:spacing w:after="140"/>
+      </w:pPr>
+      <w:r>
+        <w:t xml:space="preserve">Screenshots taken by the candidate in their own signed-in browser, cropped only to remove the browser bar and taskbar (evidence/dashboard_screenshots.md has the crop boxes and the SHA-256 of each original).</w:t>
+      </w:r>
+    </w:p>
+    <w:p>
+      <w:pPr>
+        <w:keepNext/>
+        <w:spacing w:after="60" w:before="160"/>
+        <w:jc w:val="center"/>
+      </w:pPr>
+      <w:r>
+        <w:drawing>
+          <wp:inline distT="0" distB="0" distL="0" distR="0">
+            <wp:extent cx="5715000" cy="1733550"/>
+            <wp:effectExtent t="0" r="0" b="0" l="0"/>
+            <wp:docPr id="14" name="" descr="" title=""/>
+            <wp:cNvGraphicFramePr>
+              <a:graphicFrameLocks xmlns:a="http://schemas.openxmlformats.org/drawingml/2006/main" noChangeAspect="1"/>
+            </wp:cNvGraphicFramePr>
+            <a:graphic xmlns:a="http://schemas.openxmlformats.org/drawingml/2006/main">
+              <a:graphicData uri="http://schemas.openxmlformats.org/drawingml/2006/picture">
+                <pic:pic xmlns:pic="http://schemas.openxmlformats.org/drawingml/2006/picture">
+                  <pic:nvPicPr>
+                    <pic:cNvPr id="0" name="" descr=""/>
+                    <pic:cNvPicPr>
+                      <a:picLocks noChangeAspect="1" noChangeArrowheads="1"/>
+                    </pic:cNvPicPr>
+                  </pic:nvPicPr>
+                  <pic:blipFill>
+                    <a:blip r:embed="rId22" cstate="none"/>
+                    <a:srcRect/>
+                    <a:stretch>
+                      <a:fillRect/>
+                    </a:stretch>
+                  </pic:blipFill>
+                  <pic:spPr bwMode="auto">
+                    <a:xfrm>
+                      <a:off x="0" y="0"/>
+                      <a:ext cx="5715000" cy="1733550"/>
+                    </a:xfrm>
+                    <a:prstGeom prst="rect">
+                      <a:avLst/>
+                    </a:prstGeom>
+                  </pic:spPr>
+                </pic:pic>
+              </a:graphicData>
+            </a:graphic>
+          </wp:inline>
+        </w:drawing>
+      </w:r>
+    </w:p>
+    <w:p>
+      <w:pPr>
+        <w:spacing w:after="200"/>
+        <w:jc w:val="center"/>
+      </w:pPr>
+      <w:r>
+        <w:rPr>
+          <w:i/>
+          <w:iCs/>
+          <w:color w:val="595959"/>
+          <w:sz w:val="17"/>
+          <w:szCs w:val="17"/>
+        </w:rPr>
+        <w:t xml:space="preserve">Figure 14. Dashboard page 1, Release gate: BLOCK, 10 of 10 rules failing, 5 blocking, 13 employees affected, 40 of 48 Gold records trusted; affected employees per rule by severity (cropped above a desktop notification that covered the lower chart).</w:t>
+      </w:r>
+      <w:r>
+        <w:rPr>
+          <w:color w:val="0E7C7B"/>
+          <w:sz w:val="15"/>
+          <w:szCs w:val="15"/>
+        </w:rPr>
+        <w:t xml:space="preserve">  [Screen capture (candidate's browser)]</w:t>
+      </w:r>
+    </w:p>
+    <w:p>
+      <w:pPr>
+        <w:keepNext/>
+        <w:spacing w:after="60" w:before="160"/>
+        <w:jc w:val="center"/>
+      </w:pPr>
+      <w:r>
+        <w:drawing>
+          <wp:inline distT="0" distB="0" distL="0" distR="0">
+            <wp:extent cx="5715000" cy="2714625"/>
+            <wp:effectExtent t="0" r="0" b="0" l="0"/>
+            <wp:docPr id="15" name="" descr="" title=""/>
+            <wp:cNvGraphicFramePr>
+              <a:graphicFrameLocks xmlns:a="http://schemas.openxmlformats.org/drawingml/2006/main" noChangeAspect="1"/>
+            </wp:cNvGraphicFramePr>
+            <a:graphic xmlns:a="http://schemas.openxmlformats.org/drawingml/2006/main">
+              <a:graphicData uri="http://schemas.openxmlformats.org/drawingml/2006/picture">
+                <pic:pic xmlns:pic="http://schemas.openxmlformats.org/drawingml/2006/picture">
+                  <pic:nvPicPr>
+                    <pic:cNvPr id="0" name="" descr=""/>
+                    <pic:cNvPicPr>
+                      <a:picLocks noChangeAspect="1" noChangeArrowheads="1"/>
+                    </pic:cNvPicPr>
+                  </pic:nvPicPr>
+                  <pic:blipFill>
+                    <a:blip r:embed="rId23" cstate="none"/>
+                    <a:srcRect/>
+                    <a:stretch>
+                      <a:fillRect/>
+                    </a:stretch>
+                  </pic:blipFill>
+                  <pic:spPr bwMode="auto">
+                    <a:xfrm>
+                      <a:off x="0" y="0"/>
+                      <a:ext cx="5715000" cy="2714625"/>
+                    </a:xfrm>
+                    <a:prstGeom prst="rect">
+                      <a:avLst/>
+                    </a:prstGeom>
+                  </pic:spPr>
+                </pic:pic>
+              </a:graphicData>
+            </a:graphic>
+          </wp:inline>
+        </w:drawing>
+      </w:r>
+    </w:p>
+    <w:p>
+      <w:pPr>
+        <w:spacing w:after="200"/>
+        <w:jc w:val="center"/>
+      </w:pPr>
+      <w:r>
+        <w:rPr>
+          <w:i/>
+          <w:iCs/>
+          <w:color w:val="595959"/>
+          <w:sz w:val="17"/>
+          <w:szCs w:val="17"/>
+        </w:rPr>
+        <w:t xml:space="preserve">Figure 15. Dashboard page 1: the monitoring table for run 1 (supplied data), with severity, action and alert threshold.</w:t>
+      </w:r>
+      <w:r>
+        <w:rPr>
+          <w:color w:val="0E7C7B"/>
+          <w:sz w:val="15"/>
+          <w:szCs w:val="15"/>
+        </w:rPr>
+        <w:t xml:space="preserve">  [Screen capture (candidate's browser)]</w:t>
+      </w:r>
+    </w:p>
+    <w:p>
+      <w:pPr>
+        <w:keepNext/>
+        <w:spacing w:after="60" w:before="160"/>
+        <w:jc w:val="center"/>
+      </w:pPr>
+      <w:r>
+        <w:drawing>
+          <wp:inline distT="0" distB="0" distL="0" distR="0">
+            <wp:extent cx="5715000" cy="2714625"/>
+            <wp:effectExtent t="0" r="0" b="0" l="0"/>
+            <wp:docPr id="16" name="" descr="" title=""/>
+            <wp:cNvGraphicFramePr>
+              <a:graphicFrameLocks xmlns:a="http://schemas.openxmlformats.org/drawingml/2006/main" noChangeAspect="1"/>
+            </wp:cNvGraphicFramePr>
+            <a:graphic xmlns:a="http://schemas.openxmlformats.org/drawingml/2006/main">
+              <a:graphicData uri="http://schemas.openxmlformats.org/drawingml/2006/picture">
+                <pic:pic xmlns:pic="http://schemas.openxmlformats.org/drawingml/2006/picture">
+                  <pic:nvPicPr>
+                    <pic:cNvPr id="0" name="" descr=""/>
+                    <pic:cNvPicPr>
+                      <a:picLocks noChangeAspect="1" noChangeArrowheads="1"/>
+                    </pic:cNvPicPr>
+                  </pic:nvPicPr>
+                  <pic:blipFill>
+                    <a:blip r:embed="rId24" cstate="none"/>
+                    <a:srcRect/>
+                    <a:stretch>
+                      <a:fillRect/>
+                    </a:stretch>
+                  </pic:blipFill>
+                  <pic:spPr bwMode="auto">
+                    <a:xfrm>
+                      <a:off x="0" y="0"/>
+                      <a:ext cx="5715000" cy="2714625"/>
+                    </a:xfrm>
+                    <a:prstGeom prst="rect">
+                      <a:avLst/>
+                    </a:prstGeom>
+                  </pic:spPr>
+                </pic:pic>
+              </a:graphicData>
+            </a:graphic>
+          </wp:inline>
+        </w:drawing>
+      </w:r>
+    </w:p>
+    <w:p>
+      <w:pPr>
+        <w:spacing w:after="200"/>
+        <w:jc w:val="center"/>
+      </w:pPr>
+      <w:r>
+        <w:rPr>
+          <w:i/>
+          <w:iCs/>
+          <w:color w:val="595959"/>
+          <w:sz w:val="17"/>
+          <w:szCs w:val="17"/>
+        </w:rPr>
+        <w:t xml:space="preserve">Figure 16. Dashboard page 2: failure detail by rule and employee.</w:t>
+      </w:r>
+      <w:r>
+        <w:rPr>
+          <w:color w:val="0E7C7B"/>
+          <w:sz w:val="15"/>
+          <w:szCs w:val="15"/>
+        </w:rPr>
+        <w:t xml:space="preserve">  [Screen capture (candidate's browser)]</w:t>
+      </w:r>
+    </w:p>
+    <w:p>
+      <w:pPr>
+        <w:keepNext/>
+        <w:spacing w:after="60" w:before="160"/>
+        <w:jc w:val="center"/>
+      </w:pPr>
+      <w:r>
+        <w:drawing>
+          <wp:inline distT="0" distB="0" distL="0" distR="0">
+            <wp:extent cx="5715000" cy="2714625"/>
+            <wp:effectExtent t="0" r="0" b="0" l="0"/>
+            <wp:docPr id="17" name="" descr="" title=""/>
+            <wp:cNvGraphicFramePr>
+              <a:graphicFrameLocks xmlns:a="http://schemas.openxmlformats.org/drawingml/2006/main" noChangeAspect="1"/>
+            </wp:cNvGraphicFramePr>
+            <a:graphic xmlns:a="http://schemas.openxmlformats.org/drawingml/2006/main">
+              <a:graphicData uri="http://schemas.openxmlformats.org/drawingml/2006/picture">
+                <pic:pic xmlns:pic="http://schemas.openxmlformats.org/drawingml/2006/picture">
+                  <pic:nvPicPr>
+                    <pic:cNvPr id="0" name="" descr=""/>
+                    <pic:cNvPicPr>
+                      <a:picLocks noChangeAspect="1" noChangeArrowheads="1"/>
+                    </pic:cNvPicPr>
+                  </pic:nvPicPr>
+                  <pic:blipFill>
+                    <a:blip r:embed="rId25" cstate="none"/>
+                    <a:srcRect/>
+                    <a:stretch>
+                      <a:fillRect/>
+                    </a:stretch>
+                  </pic:blipFill>
+                  <pic:spPr bwMode="auto">
+                    <a:xfrm>
+                      <a:off x="0" y="0"/>
+                      <a:ext cx="5715000" cy="2714625"/>
+                    </a:xfrm>
+                    <a:prstGeom prst="rect">
+                      <a:avLst/>
+                    </a:prstGeom>
+                  </pic:spPr>
+                </pic:pic>
+              </a:graphicData>
+            </a:graphic>
+          </wp:inline>
+        </w:drawing>
+      </w:r>
+    </w:p>
+    <w:p>
+      <w:pPr>
+        <w:spacing w:after="200"/>
+        <w:jc w:val="center"/>
+      </w:pPr>
+      <w:r>
+        <w:rPr>
+          <w:i/>
+          <w:iCs/>
+          <w:color w:val="595959"/>
+          <w:sz w:val="17"/>
+          <w:szCs w:val="17"/>
+        </w:rPr>
+        <w:t xml:space="preserve">Figure 17. Dashboard page 2: Gold against the delivered Employee 360 (45 vs 46 active), and the untrusted Gold employees.</w:t>
+      </w:r>
+      <w:r>
+        <w:rPr>
+          <w:color w:val="0E7C7B"/>
+          <w:sz w:val="15"/>
+          <w:szCs w:val="15"/>
+        </w:rPr>
+        <w:t xml:space="preserve">  [Screen capture (candidate's browser)]</w:t>
+      </w:r>
+    </w:p>
+    <w:p>
+      <w:pPr>
+        <w:keepNext/>
+        <w:spacing w:after="60" w:before="160"/>
+        <w:jc w:val="center"/>
+      </w:pPr>
+      <w:r>
+        <w:drawing>
+          <wp:inline distT="0" distB="0" distL="0" distR="0">
+            <wp:extent cx="5715000" cy="2714625"/>
+            <wp:effectExtent t="0" r="0" b="0" l="0"/>
+            <wp:docPr id="18" name="" descr="" title=""/>
+            <wp:cNvGraphicFramePr>
+              <a:graphicFrameLocks xmlns:a="http://schemas.openxmlformats.org/drawingml/2006/main" noChangeAspect="1"/>
+            </wp:cNvGraphicFramePr>
+            <a:graphic xmlns:a="http://schemas.openxmlformats.org/drawingml/2006/main">
+              <a:graphicData uri="http://schemas.openxmlformats.org/drawingml/2006/picture">
+                <pic:pic xmlns:pic="http://schemas.openxmlformats.org/drawingml/2006/picture">
+                  <pic:nvPicPr>
+                    <pic:cNvPr id="0" name="" descr=""/>
+                    <pic:cNvPicPr>
+                      <a:picLocks noChangeAspect="1" noChangeArrowheads="1"/>
+                    </pic:cNvPicPr>
+                  </pic:nvPicPr>
+                  <pic:blipFill>
+                    <a:blip r:embed="rId26" cstate="none"/>
+                    <a:srcRect/>
+                    <a:stretch>
+                      <a:fillRect/>
+                    </a:stretch>
+                  </pic:blipFill>
+                  <pic:spPr bwMode="auto">
+                    <a:xfrm>
+                      <a:off x="0" y="0"/>
+                      <a:ext cx="5715000" cy="2714625"/>
+                    </a:xfrm>
+                    <a:prstGeom prst="rect">
+                      <a:avLst/>
+                    </a:prstGeom>
+                  </pic:spPr>
+                </pic:pic>
+              </a:graphicData>
+            </a:graphic>
+          </wp:inline>
+        </w:drawing>
+      </w:r>
+    </w:p>
+    <w:p>
+      <w:pPr>
+        <w:spacing w:after="200"/>
+        <w:jc w:val="center"/>
+      </w:pPr>
+      <w:r>
+        <w:rPr>
+          <w:i/>
+          <w:iCs/>
+          <w:color w:val="595959"/>
+          <w:sz w:val="17"/>
+          <w:szCs w:val="17"/>
+        </w:rPr>
+        <w:t xml:space="preserve">Figure 18. Dashboard page 2: employees per reconciliation category. The legitimate exception is grey and not counted as a failure.</w:t>
+      </w:r>
+      <w:r>
+        <w:rPr>
+          <w:color w:val="0E7C7B"/>
+          <w:sz w:val="15"/>
+          <w:szCs w:val="15"/>
+        </w:rPr>
+        <w:t xml:space="preserve">  [Screen capture (candidate's browser)]</w:t>
+      </w:r>
+    </w:p>
+    <w:p>
+      <w:pPr>
         <w:pStyle w:val="Heading1"/>
         <w:pageBreakBefore/>
         <w:spacing w:after="160"/>
@@ -23813,6 +24176,731 @@
                 <w:szCs w:val="15"/>
               </w:rPr>
               <w:t xml:space="preserve">f30e927f352ca320</w:t>
+            </w:r>
+          </w:p>
+        </w:tc>
+      </w:tr>
+      <w:tr>
+        <w:trPr>
+          <w:cantSplit/>
+        </w:trPr>
+        <w:tc>
+          <w:tcPr>
+            <w:tcW w:type="dxa" w:w="600"/>
+            <w:shd w:fill="F7F9FC" w:val="clear"/>
+            <w:tcMar>
+              <w:top w:type="dxa" w:w="50"/>
+              <w:left w:type="dxa" w:w="90"/>
+              <w:bottom w:type="dxa" w:w="50"/>
+              <w:right w:type="dxa" w:w="90"/>
+            </w:tcMar>
+            <w:vAlign w:val="center"/>
+          </w:tcPr>
+          <w:p>
+            <w:pPr>
+              <w:jc w:val="left"/>
+            </w:pPr>
+            <w:r>
+              <w:rPr>
+                <w:b w:val="false"/>
+                <w:bCs w:val="false"/>
+                <w:color w:val="000000"/>
+                <w:sz w:val="15"/>
+                <w:szCs w:val="15"/>
+              </w:rPr>
+              <w:t xml:space="preserve">14</w:t>
+            </w:r>
+          </w:p>
+        </w:tc>
+        <w:tc>
+          <w:tcPr>
+            <w:tcW w:type="dxa" w:w="2300"/>
+            <w:shd w:fill="F7F9FC" w:val="clear"/>
+            <w:tcMar>
+              <w:top w:type="dxa" w:w="50"/>
+              <w:left w:type="dxa" w:w="90"/>
+              <w:bottom w:type="dxa" w:w="50"/>
+              <w:right w:type="dxa" w:w="90"/>
+            </w:tcMar>
+            <w:vAlign w:val="center"/>
+          </w:tcPr>
+          <w:p>
+            <w:pPr>
+              <w:jc w:val="left"/>
+            </w:pPr>
+            <w:r>
+              <w:rPr>
+                <w:b w:val="false"/>
+                <w:bCs w:val="false"/>
+                <w:color w:val="000000"/>
+                <w:sz w:val="15"/>
+                <w:szCs w:val="15"/>
+              </w:rPr>
+              <w:t xml:space="preserve">genuine_dashboard_1_counters_chart.png</w:t>
+            </w:r>
+          </w:p>
+        </w:tc>
+        <w:tc>
+          <w:tcPr>
+            <w:tcW w:type="dxa" w:w="1500"/>
+            <w:shd w:fill="F7F9FC" w:val="clear"/>
+            <w:tcMar>
+              <w:top w:type="dxa" w:w="50"/>
+              <w:left w:type="dxa" w:w="90"/>
+              <w:bottom w:type="dxa" w:w="50"/>
+              <w:right w:type="dxa" w:w="90"/>
+            </w:tcMar>
+            <w:vAlign w:val="center"/>
+          </w:tcPr>
+          <w:p>
+            <w:pPr>
+              <w:jc w:val="left"/>
+            </w:pPr>
+            <w:r>
+              <w:rPr>
+                <w:b w:val="false"/>
+                <w:bCs w:val="false"/>
+                <w:color w:val="000000"/>
+                <w:sz w:val="15"/>
+                <w:szCs w:val="15"/>
+              </w:rPr>
+              <w:t xml:space="preserve">Screen capture (candidate's browser)</w:t>
+            </w:r>
+          </w:p>
+        </w:tc>
+        <w:tc>
+          <w:tcPr>
+            <w:tcW w:type="dxa" w:w="3260"/>
+            <w:shd w:fill="F7F9FC" w:val="clear"/>
+            <w:tcMar>
+              <w:top w:type="dxa" w:w="50"/>
+              <w:left w:type="dxa" w:w="90"/>
+              <w:bottom w:type="dxa" w:w="50"/>
+              <w:right w:type="dxa" w:w="90"/>
+            </w:tcMar>
+            <w:vAlign w:val="center"/>
+          </w:tcPr>
+          <w:p>
+            <w:pPr>
+              <w:jc w:val="left"/>
+            </w:pPr>
+            <w:r>
+              <w:rPr>
+                <w:b w:val="false"/>
+                <w:bCs w:val="false"/>
+                <w:color w:val="000000"/>
+                <w:sz w:val="15"/>
+                <w:szCs w:val="15"/>
+              </w:rPr>
+              <w:t xml:space="preserve">evidence/dashboard_screenshots.md</w:t>
+            </w:r>
+          </w:p>
+        </w:tc>
+        <w:tc>
+          <w:tcPr>
+            <w:tcW w:type="dxa" w:w="1700"/>
+            <w:shd w:fill="F7F9FC" w:val="clear"/>
+            <w:tcMar>
+              <w:top w:type="dxa" w:w="50"/>
+              <w:left w:type="dxa" w:w="90"/>
+              <w:bottom w:type="dxa" w:w="50"/>
+              <w:right w:type="dxa" w:w="90"/>
+            </w:tcMar>
+            <w:vAlign w:val="center"/>
+          </w:tcPr>
+          <w:p>
+            <w:pPr>
+              <w:jc w:val="left"/>
+            </w:pPr>
+            <w:r>
+              <w:rPr>
+                <w:b w:val="false"/>
+                <w:bCs w:val="false"/>
+                <w:color w:val="000000"/>
+                <w:sz w:val="15"/>
+                <w:szCs w:val="15"/>
+              </w:rPr>
+              <w:t xml:space="preserve">a1a9709d7f57f7bd</w:t>
+            </w:r>
+          </w:p>
+        </w:tc>
+      </w:tr>
+      <w:tr>
+        <w:trPr>
+          <w:cantSplit/>
+        </w:trPr>
+        <w:tc>
+          <w:tcPr>
+            <w:tcW w:type="dxa" w:w="600"/>
+            <w:shd w:fill="FFFFFF" w:val="clear"/>
+            <w:tcMar>
+              <w:top w:type="dxa" w:w="50"/>
+              <w:left w:type="dxa" w:w="90"/>
+              <w:bottom w:type="dxa" w:w="50"/>
+              <w:right w:type="dxa" w:w="90"/>
+            </w:tcMar>
+            <w:vAlign w:val="center"/>
+          </w:tcPr>
+          <w:p>
+            <w:pPr>
+              <w:jc w:val="left"/>
+            </w:pPr>
+            <w:r>
+              <w:rPr>
+                <w:b w:val="false"/>
+                <w:bCs w:val="false"/>
+                <w:color w:val="000000"/>
+                <w:sz w:val="15"/>
+                <w:szCs w:val="15"/>
+              </w:rPr>
+              <w:t xml:space="preserve">15</w:t>
+            </w:r>
+          </w:p>
+        </w:tc>
+        <w:tc>
+          <w:tcPr>
+            <w:tcW w:type="dxa" w:w="2300"/>
+            <w:shd w:fill="FFFFFF" w:val="clear"/>
+            <w:tcMar>
+              <w:top w:type="dxa" w:w="50"/>
+              <w:left w:type="dxa" w:w="90"/>
+              <w:bottom w:type="dxa" w:w="50"/>
+              <w:right w:type="dxa" w:w="90"/>
+            </w:tcMar>
+            <w:vAlign w:val="center"/>
+          </w:tcPr>
+          <w:p>
+            <w:pPr>
+              <w:jc w:val="left"/>
+            </w:pPr>
+            <w:r>
+              <w:rPr>
+                <w:b w:val="false"/>
+                <w:bCs w:val="false"/>
+                <w:color w:val="000000"/>
+                <w:sz w:val="15"/>
+                <w:szCs w:val="15"/>
+              </w:rPr>
+              <w:t xml:space="preserve">genuine_dashboard_1_rule_table.png</w:t>
+            </w:r>
+          </w:p>
+        </w:tc>
+        <w:tc>
+          <w:tcPr>
+            <w:tcW w:type="dxa" w:w="1500"/>
+            <w:shd w:fill="FFFFFF" w:val="clear"/>
+            <w:tcMar>
+              <w:top w:type="dxa" w:w="50"/>
+              <w:left w:type="dxa" w:w="90"/>
+              <w:bottom w:type="dxa" w:w="50"/>
+              <w:right w:type="dxa" w:w="90"/>
+            </w:tcMar>
+            <w:vAlign w:val="center"/>
+          </w:tcPr>
+          <w:p>
+            <w:pPr>
+              <w:jc w:val="left"/>
+            </w:pPr>
+            <w:r>
+              <w:rPr>
+                <w:b w:val="false"/>
+                <w:bCs w:val="false"/>
+                <w:color w:val="000000"/>
+                <w:sz w:val="15"/>
+                <w:szCs w:val="15"/>
+              </w:rPr>
+              <w:t xml:space="preserve">Screen capture (candidate's browser)</w:t>
+            </w:r>
+          </w:p>
+        </w:tc>
+        <w:tc>
+          <w:tcPr>
+            <w:tcW w:type="dxa" w:w="3260"/>
+            <w:shd w:fill="FFFFFF" w:val="clear"/>
+            <w:tcMar>
+              <w:top w:type="dxa" w:w="50"/>
+              <w:left w:type="dxa" w:w="90"/>
+              <w:bottom w:type="dxa" w:w="50"/>
+              <w:right w:type="dxa" w:w="90"/>
+            </w:tcMar>
+            <w:vAlign w:val="center"/>
+          </w:tcPr>
+          <w:p>
+            <w:pPr>
+              <w:jc w:val="left"/>
+            </w:pPr>
+            <w:r>
+              <w:rPr>
+                <w:b w:val="false"/>
+                <w:bCs w:val="false"/>
+                <w:color w:val="000000"/>
+                <w:sz w:val="15"/>
+                <w:szCs w:val="15"/>
+              </w:rPr>
+              <w:t xml:space="preserve">evidence/dashboard_screenshots.md</w:t>
+            </w:r>
+          </w:p>
+        </w:tc>
+        <w:tc>
+          <w:tcPr>
+            <w:tcW w:type="dxa" w:w="1700"/>
+            <w:shd w:fill="FFFFFF" w:val="clear"/>
+            <w:tcMar>
+              <w:top w:type="dxa" w:w="50"/>
+              <w:left w:type="dxa" w:w="90"/>
+              <w:bottom w:type="dxa" w:w="50"/>
+              <w:right w:type="dxa" w:w="90"/>
+            </w:tcMar>
+            <w:vAlign w:val="center"/>
+          </w:tcPr>
+          <w:p>
+            <w:pPr>
+              <w:jc w:val="left"/>
+            </w:pPr>
+            <w:r>
+              <w:rPr>
+                <w:b w:val="false"/>
+                <w:bCs w:val="false"/>
+                <w:color w:val="000000"/>
+                <w:sz w:val="15"/>
+                <w:szCs w:val="15"/>
+              </w:rPr>
+              <w:t xml:space="preserve">de3bf6a4978fe1d4</w:t>
+            </w:r>
+          </w:p>
+        </w:tc>
+      </w:tr>
+      <w:tr>
+        <w:trPr>
+          <w:cantSplit/>
+        </w:trPr>
+        <w:tc>
+          <w:tcPr>
+            <w:tcW w:type="dxa" w:w="600"/>
+            <w:shd w:fill="F7F9FC" w:val="clear"/>
+            <w:tcMar>
+              <w:top w:type="dxa" w:w="50"/>
+              <w:left w:type="dxa" w:w="90"/>
+              <w:bottom w:type="dxa" w:w="50"/>
+              <w:right w:type="dxa" w:w="90"/>
+            </w:tcMar>
+            <w:vAlign w:val="center"/>
+          </w:tcPr>
+          <w:p>
+            <w:pPr>
+              <w:jc w:val="left"/>
+            </w:pPr>
+            <w:r>
+              <w:rPr>
+                <w:b w:val="false"/>
+                <w:bCs w:val="false"/>
+                <w:color w:val="000000"/>
+                <w:sz w:val="15"/>
+                <w:szCs w:val="15"/>
+              </w:rPr>
+              <w:t xml:space="preserve">16</w:t>
+            </w:r>
+          </w:p>
+        </w:tc>
+        <w:tc>
+          <w:tcPr>
+            <w:tcW w:type="dxa" w:w="2300"/>
+            <w:shd w:fill="F7F9FC" w:val="clear"/>
+            <w:tcMar>
+              <w:top w:type="dxa" w:w="50"/>
+              <w:left w:type="dxa" w:w="90"/>
+              <w:bottom w:type="dxa" w:w="50"/>
+              <w:right w:type="dxa" w:w="90"/>
+            </w:tcMar>
+            <w:vAlign w:val="center"/>
+          </w:tcPr>
+          <w:p>
+            <w:pPr>
+              <w:jc w:val="left"/>
+            </w:pPr>
+            <w:r>
+              <w:rPr>
+                <w:b w:val="false"/>
+                <w:bCs w:val="false"/>
+                <w:color w:val="000000"/>
+                <w:sz w:val="15"/>
+                <w:szCs w:val="15"/>
+              </w:rPr>
+              <w:t xml:space="preserve">genuine_dashboard_2_failure_detail.png</w:t>
+            </w:r>
+          </w:p>
+        </w:tc>
+        <w:tc>
+          <w:tcPr>
+            <w:tcW w:type="dxa" w:w="1500"/>
+            <w:shd w:fill="F7F9FC" w:val="clear"/>
+            <w:tcMar>
+              <w:top w:type="dxa" w:w="50"/>
+              <w:left w:type="dxa" w:w="90"/>
+              <w:bottom w:type="dxa" w:w="50"/>
+              <w:right w:type="dxa" w:w="90"/>
+            </w:tcMar>
+            <w:vAlign w:val="center"/>
+          </w:tcPr>
+          <w:p>
+            <w:pPr>
+              <w:jc w:val="left"/>
+            </w:pPr>
+            <w:r>
+              <w:rPr>
+                <w:b w:val="false"/>
+                <w:bCs w:val="false"/>
+                <w:color w:val="000000"/>
+                <w:sz w:val="15"/>
+                <w:szCs w:val="15"/>
+              </w:rPr>
+              <w:t xml:space="preserve">Screen capture (candidate's browser)</w:t>
+            </w:r>
+          </w:p>
+        </w:tc>
+        <w:tc>
+          <w:tcPr>
+            <w:tcW w:type="dxa" w:w="3260"/>
+            <w:shd w:fill="F7F9FC" w:val="clear"/>
+            <w:tcMar>
+              <w:top w:type="dxa" w:w="50"/>
+              <w:left w:type="dxa" w:w="90"/>
+              <w:bottom w:type="dxa" w:w="50"/>
+              <w:right w:type="dxa" w:w="90"/>
+            </w:tcMar>
+            <w:vAlign w:val="center"/>
+          </w:tcPr>
+          <w:p>
+            <w:pPr>
+              <w:jc w:val="left"/>
+            </w:pPr>
+            <w:r>
+              <w:rPr>
+                <w:b w:val="false"/>
+                <w:bCs w:val="false"/>
+                <w:color w:val="000000"/>
+                <w:sz w:val="15"/>
+                <w:szCs w:val="15"/>
+              </w:rPr>
+              <w:t xml:space="preserve">evidence/dashboard_screenshots.md</w:t>
+            </w:r>
+          </w:p>
+        </w:tc>
+        <w:tc>
+          <w:tcPr>
+            <w:tcW w:type="dxa" w:w="1700"/>
+            <w:shd w:fill="F7F9FC" w:val="clear"/>
+            <w:tcMar>
+              <w:top w:type="dxa" w:w="50"/>
+              <w:left w:type="dxa" w:w="90"/>
+              <w:bottom w:type="dxa" w:w="50"/>
+              <w:right w:type="dxa" w:w="90"/>
+            </w:tcMar>
+            <w:vAlign w:val="center"/>
+          </w:tcPr>
+          <w:p>
+            <w:pPr>
+              <w:jc w:val="left"/>
+            </w:pPr>
+            <w:r>
+              <w:rPr>
+                <w:b w:val="false"/>
+                <w:bCs w:val="false"/>
+                <w:color w:val="000000"/>
+                <w:sz w:val="15"/>
+                <w:szCs w:val="15"/>
+              </w:rPr>
+              <w:t xml:space="preserve">ab22abc5739663d4</w:t>
+            </w:r>
+          </w:p>
+        </w:tc>
+      </w:tr>
+      <w:tr>
+        <w:trPr>
+          <w:cantSplit/>
+        </w:trPr>
+        <w:tc>
+          <w:tcPr>
+            <w:tcW w:type="dxa" w:w="600"/>
+            <w:shd w:fill="FFFFFF" w:val="clear"/>
+            <w:tcMar>
+              <w:top w:type="dxa" w:w="50"/>
+              <w:left w:type="dxa" w:w="90"/>
+              <w:bottom w:type="dxa" w:w="50"/>
+              <w:right w:type="dxa" w:w="90"/>
+            </w:tcMar>
+            <w:vAlign w:val="center"/>
+          </w:tcPr>
+          <w:p>
+            <w:pPr>
+              <w:jc w:val="left"/>
+            </w:pPr>
+            <w:r>
+              <w:rPr>
+                <w:b w:val="false"/>
+                <w:bCs w:val="false"/>
+                <w:color w:val="000000"/>
+                <w:sz w:val="15"/>
+                <w:szCs w:val="15"/>
+              </w:rPr>
+              <w:t xml:space="preserve">17</w:t>
+            </w:r>
+          </w:p>
+        </w:tc>
+        <w:tc>
+          <w:tcPr>
+            <w:tcW w:type="dxa" w:w="2300"/>
+            <w:shd w:fill="FFFFFF" w:val="clear"/>
+            <w:tcMar>
+              <w:top w:type="dxa" w:w="50"/>
+              <w:left w:type="dxa" w:w="90"/>
+              <w:bottom w:type="dxa" w:w="50"/>
+              <w:right w:type="dxa" w:w="90"/>
+            </w:tcMar>
+            <w:vAlign w:val="center"/>
+          </w:tcPr>
+          <w:p>
+            <w:pPr>
+              <w:jc w:val="left"/>
+            </w:pPr>
+            <w:r>
+              <w:rPr>
+                <w:b w:val="false"/>
+                <w:bCs w:val="false"/>
+                <w:color w:val="000000"/>
+                <w:sz w:val="15"/>
+                <w:szCs w:val="15"/>
+              </w:rPr>
+              <w:t xml:space="preserve">genuine_dashboard_2_gold.png</w:t>
+            </w:r>
+          </w:p>
+        </w:tc>
+        <w:tc>
+          <w:tcPr>
+            <w:tcW w:type="dxa" w:w="1500"/>
+            <w:shd w:fill="FFFFFF" w:val="clear"/>
+            <w:tcMar>
+              <w:top w:type="dxa" w:w="50"/>
+              <w:left w:type="dxa" w:w="90"/>
+              <w:bottom w:type="dxa" w:w="50"/>
+              <w:right w:type="dxa" w:w="90"/>
+            </w:tcMar>
+            <w:vAlign w:val="center"/>
+          </w:tcPr>
+          <w:p>
+            <w:pPr>
+              <w:jc w:val="left"/>
+            </w:pPr>
+            <w:r>
+              <w:rPr>
+                <w:b w:val="false"/>
+                <w:bCs w:val="false"/>
+                <w:color w:val="000000"/>
+                <w:sz w:val="15"/>
+                <w:szCs w:val="15"/>
+              </w:rPr>
+              <w:t xml:space="preserve">Screen capture (candidate's browser)</w:t>
+            </w:r>
+          </w:p>
+        </w:tc>
+        <w:tc>
+          <w:tcPr>
+            <w:tcW w:type="dxa" w:w="3260"/>
+            <w:shd w:fill="FFFFFF" w:val="clear"/>
+            <w:tcMar>
+              <w:top w:type="dxa" w:w="50"/>
+              <w:left w:type="dxa" w:w="90"/>
+              <w:bottom w:type="dxa" w:w="50"/>
+              <w:right w:type="dxa" w:w="90"/>
+            </w:tcMar>
+            <w:vAlign w:val="center"/>
+          </w:tcPr>
+          <w:p>
+            <w:pPr>
+              <w:jc w:val="left"/>
+            </w:pPr>
+            <w:r>
+              <w:rPr>
+                <w:b w:val="false"/>
+                <w:bCs w:val="false"/>
+                <w:color w:val="000000"/>
+                <w:sz w:val="15"/>
+                <w:szCs w:val="15"/>
+              </w:rPr>
+              <w:t xml:space="preserve">evidence/dashboard_screenshots.md</w:t>
+            </w:r>
+          </w:p>
+        </w:tc>
+        <w:tc>
+          <w:tcPr>
+            <w:tcW w:type="dxa" w:w="1700"/>
+            <w:shd w:fill="FFFFFF" w:val="clear"/>
+            <w:tcMar>
+              <w:top w:type="dxa" w:w="50"/>
+              <w:left w:type="dxa" w:w="90"/>
+              <w:bottom w:type="dxa" w:w="50"/>
+              <w:right w:type="dxa" w:w="90"/>
+            </w:tcMar>
+            <w:vAlign w:val="center"/>
+          </w:tcPr>
+          <w:p>
+            <w:pPr>
+              <w:jc w:val="left"/>
+            </w:pPr>
+            <w:r>
+              <w:rPr>
+                <w:b w:val="false"/>
+                <w:bCs w:val="false"/>
+                <w:color w:val="000000"/>
+                <w:sz w:val="15"/>
+                <w:szCs w:val="15"/>
+              </w:rPr>
+              <w:t xml:space="preserve">6343696869d9ec59</w:t>
+            </w:r>
+          </w:p>
+        </w:tc>
+      </w:tr>
+      <w:tr>
+        <w:trPr>
+          <w:cantSplit/>
+        </w:trPr>
+        <w:tc>
+          <w:tcPr>
+            <w:tcW w:type="dxa" w:w="600"/>
+            <w:shd w:fill="F7F9FC" w:val="clear"/>
+            <w:tcMar>
+              <w:top w:type="dxa" w:w="50"/>
+              <w:left w:type="dxa" w:w="90"/>
+              <w:bottom w:type="dxa" w:w="50"/>
+              <w:right w:type="dxa" w:w="90"/>
+            </w:tcMar>
+            <w:vAlign w:val="center"/>
+          </w:tcPr>
+          <w:p>
+            <w:pPr>
+              <w:jc w:val="left"/>
+            </w:pPr>
+            <w:r>
+              <w:rPr>
+                <w:b w:val="false"/>
+                <w:bCs w:val="false"/>
+                <w:color w:val="000000"/>
+                <w:sz w:val="15"/>
+                <w:szCs w:val="15"/>
+              </w:rPr>
+              <w:t xml:space="preserve">18</w:t>
+            </w:r>
+          </w:p>
+        </w:tc>
+        <w:tc>
+          <w:tcPr>
+            <w:tcW w:type="dxa" w:w="2300"/>
+            <w:shd w:fill="F7F9FC" w:val="clear"/>
+            <w:tcMar>
+              <w:top w:type="dxa" w:w="50"/>
+              <w:left w:type="dxa" w:w="90"/>
+              <w:bottom w:type="dxa" w:w="50"/>
+              <w:right w:type="dxa" w:w="90"/>
+            </w:tcMar>
+            <w:vAlign w:val="center"/>
+          </w:tcPr>
+          <w:p>
+            <w:pPr>
+              <w:jc w:val="left"/>
+            </w:pPr>
+            <w:r>
+              <w:rPr>
+                <w:b w:val="false"/>
+                <w:bCs w:val="false"/>
+                <w:color w:val="000000"/>
+                <w:sz w:val="15"/>
+                <w:szCs w:val="15"/>
+              </w:rPr>
+              <w:t xml:space="preserve">genuine_dashboard_2_recon_categories.png</w:t>
+            </w:r>
+          </w:p>
+        </w:tc>
+        <w:tc>
+          <w:tcPr>
+            <w:tcW w:type="dxa" w:w="1500"/>
+            <w:shd w:fill="F7F9FC" w:val="clear"/>
+            <w:tcMar>
+              <w:top w:type="dxa" w:w="50"/>
+              <w:left w:type="dxa" w:w="90"/>
+              <w:bottom w:type="dxa" w:w="50"/>
+              <w:right w:type="dxa" w:w="90"/>
+            </w:tcMar>
+            <w:vAlign w:val="center"/>
+          </w:tcPr>
+          <w:p>
+            <w:pPr>
+              <w:jc w:val="left"/>
+            </w:pPr>
+            <w:r>
+              <w:rPr>
+                <w:b w:val="false"/>
+                <w:bCs w:val="false"/>
+                <w:color w:val="000000"/>
+                <w:sz w:val="15"/>
+                <w:szCs w:val="15"/>
+              </w:rPr>
+              <w:t xml:space="preserve">Screen capture (candidate's browser)</w:t>
+            </w:r>
+          </w:p>
+        </w:tc>
+        <w:tc>
+          <w:tcPr>
+            <w:tcW w:type="dxa" w:w="3260"/>
+            <w:shd w:fill="F7F9FC" w:val="clear"/>
+            <w:tcMar>
+              <w:top w:type="dxa" w:w="50"/>
+              <w:left w:type="dxa" w:w="90"/>
+              <w:bottom w:type="dxa" w:w="50"/>
+              <w:right w:type="dxa" w:w="90"/>
+            </w:tcMar>
+            <w:vAlign w:val="center"/>
+          </w:tcPr>
+          <w:p>
+            <w:pPr>
+              <w:jc w:val="left"/>
+            </w:pPr>
+            <w:r>
+              <w:rPr>
+                <w:b w:val="false"/>
+                <w:bCs w:val="false"/>
+                <w:color w:val="000000"/>
+                <w:sz w:val="15"/>
+                <w:szCs w:val="15"/>
+              </w:rPr>
+              <w:t xml:space="preserve">evidence/dashboard_screenshots.md</w:t>
+            </w:r>
+          </w:p>
+        </w:tc>
+        <w:tc>
+          <w:tcPr>
+            <w:tcW w:type="dxa" w:w="1700"/>
+            <w:shd w:fill="F7F9FC" w:val="clear"/>
+            <w:tcMar>
+              <w:top w:type="dxa" w:w="50"/>
+              <w:left w:type="dxa" w:w="90"/>
+              <w:bottom w:type="dxa" w:w="50"/>
+              <w:right w:type="dxa" w:w="90"/>
+            </w:tcMar>
+            <w:vAlign w:val="center"/>
+          </w:tcPr>
+          <w:p>
+            <w:pPr>
+              <w:jc w:val="left"/>
+            </w:pPr>
+            <w:r>
+              <w:rPr>
+                <w:b w:val="false"/>
+                <w:bCs w:val="false"/>
+                <w:color w:val="000000"/>
+                <w:sz w:val="15"/>
+                <w:szCs w:val="15"/>
+              </w:rPr>
+              <w:t xml:space="preserve">f9ca9f27b6873532</w:t>
             </w:r>
           </w:p>
         </w:tc>

</xml_diff>